<commit_message>
swiss addded europeSmall created
</commit_message>
<xml_diff>
--- a/docs/conquest/bankMaking.docx
+++ b/docs/conquest/bankMaking.docx
@@ -107,6 +107,7 @@
       <w:r>
         <w:rPr>
           <w:rFonts w:ascii="Times New Roman" w:hAnsi="Times New Roman" w:cs="Times New Roman"/>
+          <w:noProof/>
           <w:sz w:val="24"/>
           <w:szCs w:val="24"/>
         </w:rPr>
@@ -162,23 +163,13 @@
           <w:szCs w:val="24"/>
         </w:rPr>
       </w:pPr>
-      <w:proofErr w:type="gramStart"/>
-      <w:r>
-        <w:rPr>
-          <w:rFonts w:ascii="Times New Roman" w:hAnsi="Times New Roman" w:cs="Times New Roman"/>
-          <w:sz w:val="24"/>
-          <w:szCs w:val="24"/>
-        </w:rPr>
-        <w:t>will</w:t>
-      </w:r>
-      <w:proofErr w:type="gramEnd"/>
-      <w:r>
-        <w:rPr>
-          <w:rFonts w:ascii="Times New Roman" w:hAnsi="Times New Roman" w:cs="Times New Roman"/>
-          <w:sz w:val="24"/>
-          <w:szCs w:val="24"/>
-        </w:rPr>
-        <w:t xml:space="preserve"> </w:t>
+      <w:r>
+        <w:rPr>
+          <w:rFonts w:ascii="Times New Roman" w:hAnsi="Times New Roman" w:cs="Times New Roman"/>
+          <w:sz w:val="24"/>
+          <w:szCs w:val="24"/>
+        </w:rPr>
+        <w:t xml:space="preserve">will </w:t>
       </w:r>
       <w:r>
         <w:rPr>
@@ -230,25 +221,41 @@
           <w:sz w:val="24"/>
           <w:szCs w:val="24"/>
         </w:rPr>
-        <w:t xml:space="preserve">For </w:t>
-      </w:r>
-      <w:proofErr w:type="gramStart"/>
-      <w:r>
-        <w:rPr>
-          <w:rFonts w:ascii="Times New Roman" w:hAnsi="Times New Roman" w:cs="Times New Roman"/>
-          <w:sz w:val="24"/>
-          <w:szCs w:val="24"/>
-        </w:rPr>
-        <w:t>integers</w:t>
-      </w:r>
-      <w:proofErr w:type="gramEnd"/>
-      <w:r>
-        <w:rPr>
-          <w:rFonts w:ascii="Times New Roman" w:hAnsi="Times New Roman" w:cs="Times New Roman"/>
-          <w:sz w:val="24"/>
-          <w:szCs w:val="24"/>
-        </w:rPr>
-        <w:t xml:space="preserve"> the students must provide the exact answer (with no decimals).</w:t>
+        <w:t>For integers</w:t>
+      </w:r>
+      <w:r>
+        <w:rPr>
+          <w:rFonts w:ascii="Times New Roman" w:hAnsi="Times New Roman" w:cs="Times New Roman"/>
+          <w:sz w:val="24"/>
+          <w:szCs w:val="24"/>
+        </w:rPr>
+        <w:t>,</w:t>
+      </w:r>
+      <w:bookmarkStart w:id="0" w:name="_GoBack"/>
+      <w:bookmarkEnd w:id="0"/>
+      <w:r>
+        <w:rPr>
+          <w:rFonts w:ascii="Times New Roman" w:hAnsi="Times New Roman" w:cs="Times New Roman"/>
+          <w:sz w:val="24"/>
+          <w:szCs w:val="24"/>
+        </w:rPr>
+        <w:t xml:space="preserve"> the students must provide the exact </w:t>
+      </w:r>
+      <w:r>
+        <w:rPr>
+          <w:rFonts w:ascii="Times New Roman" w:hAnsi="Times New Roman" w:cs="Times New Roman"/>
+          <w:sz w:val="24"/>
+          <w:szCs w:val="24"/>
+        </w:rPr>
+        <w:t>answer</w:t>
+      </w:r>
+      <w:r>
+        <w:rPr>
+          <w:rFonts w:ascii="Times New Roman" w:hAnsi="Times New Roman" w:cs="Times New Roman"/>
+          <w:sz w:val="24"/>
+          <w:szCs w:val="24"/>
+        </w:rPr>
+        <w:t>.</w:t>
       </w:r>
     </w:p>
     <w:p>
@@ -265,59 +272,7 @@
           <w:sz w:val="24"/>
           <w:szCs w:val="24"/>
         </w:rPr>
-        <w:t>For decimals, their an</w:t>
-      </w:r>
-      <w:r>
-        <w:rPr>
-          <w:rFonts w:ascii="Times New Roman" w:hAnsi="Times New Roman" w:cs="Times New Roman"/>
-          <w:sz w:val="24"/>
-          <w:szCs w:val="24"/>
-        </w:rPr>
-        <w:t>swer must</w:t>
-      </w:r>
-      <w:r>
-        <w:rPr>
-          <w:rFonts w:ascii="Times New Roman" w:hAnsi="Times New Roman" w:cs="Times New Roman"/>
-          <w:sz w:val="24"/>
-          <w:szCs w:val="24"/>
-        </w:rPr>
-        <w:t xml:space="preserve"> be</w:t>
-      </w:r>
-      <w:bookmarkStart w:id="0" w:name="_GoBack"/>
-      <w:bookmarkEnd w:id="0"/>
-      <w:r>
-        <w:rPr>
-          <w:rFonts w:ascii="Times New Roman" w:hAnsi="Times New Roman" w:cs="Times New Roman"/>
-          <w:sz w:val="24"/>
-          <w:szCs w:val="24"/>
-        </w:rPr>
-        <w:t xml:space="preserve"> </w:t>
-      </w:r>
-      <w:proofErr w:type="gramStart"/>
-      <w:r>
-        <w:rPr>
-          <w:rFonts w:ascii="Times New Roman" w:hAnsi="Times New Roman" w:cs="Times New Roman"/>
-          <w:sz w:val="24"/>
-          <w:szCs w:val="24"/>
-        </w:rPr>
-        <w:t>exactly the</w:t>
-      </w:r>
-      <w:proofErr w:type="gramEnd"/>
-      <w:r>
-        <w:rPr>
-          <w:rFonts w:ascii="Times New Roman" w:hAnsi="Times New Roman" w:cs="Times New Roman"/>
-          <w:sz w:val="24"/>
-          <w:szCs w:val="24"/>
-        </w:rPr>
-        <w:t xml:space="preserve"> same as the solution </w:t>
-      </w:r>
-      <w:r>
-        <w:rPr>
-          <w:rFonts w:ascii="Times New Roman" w:hAnsi="Times New Roman" w:cs="Times New Roman"/>
-          <w:sz w:val="24"/>
-          <w:szCs w:val="24"/>
-        </w:rPr>
-        <w:t>either before or after rounding their answer to 3 significant figures (the computer will do the rounding for them, so -1.4999999 = -1.5).</w:t>
+        <w:t>For decimals, they can round their answer to at least 3 significant figures.</w:t>
       </w:r>
     </w:p>
     <w:p>
@@ -415,7 +370,6 @@
           <w:szCs w:val="24"/>
         </w:rPr>
       </w:pPr>
-      <w:proofErr w:type="gramStart"/>
       <w:r>
         <w:rPr>
           <w:rFonts w:ascii="Times New Roman" w:hAnsi="Times New Roman" w:cs="Times New Roman"/>
@@ -430,16 +384,15 @@
           <w:sz w:val="24"/>
           <w:szCs w:val="24"/>
         </w:rPr>
-        <w:t>nd</w:t>
-      </w:r>
-      <w:proofErr w:type="gramEnd"/>
-      <w:r>
-        <w:rPr>
-          <w:rFonts w:ascii="Times New Roman" w:hAnsi="Times New Roman" w:cs="Times New Roman"/>
-          <w:sz w:val="24"/>
-          <w:szCs w:val="24"/>
-        </w:rPr>
-        <w:t xml:space="preserve"> drawn or doodled </w:t>
+        <w:t xml:space="preserve"> </w:t>
+      </w:r>
+      <w:r>
+        <w:rPr>
+          <w:rFonts w:ascii="Times New Roman" w:hAnsi="Times New Roman" w:cs="Times New Roman"/>
+          <w:sz w:val="24"/>
+          <w:szCs w:val="24"/>
+        </w:rPr>
+        <w:t xml:space="preserve">drawn or doodled </w:t>
       </w:r>
       <w:r>
         <w:rPr>

</xml_diff>

<commit_message>
conquest: notice when disconnected and trying to submit
</commit_message>
<xml_diff>
--- a/docs/conquest/bankMaking.docx
+++ b/docs/conquest/bankMaking.docx
@@ -2,6 +2,23 @@
 <file path=word/document.xml><?xml version="1.0" encoding="utf-8"?>
 <w:document xmlns:wpc="http://schemas.microsoft.com/office/word/2010/wordprocessingCanvas" xmlns:cx="http://schemas.microsoft.com/office/drawing/2014/chartex" xmlns:cx1="http://schemas.microsoft.com/office/drawing/2015/9/8/chartex" xmlns:mc="http://schemas.openxmlformats.org/markup-compatibility/2006" xmlns:o="urn:schemas-microsoft-com:office:office" xmlns:r="http://schemas.openxmlformats.org/officeDocument/2006/relationships" xmlns:m="http://schemas.openxmlformats.org/officeDocument/2006/math" xmlns:v="urn:schemas-microsoft-com:vml" xmlns:wp14="http://schemas.microsoft.com/office/word/2010/wordprocessingDrawing" xmlns:wp="http://schemas.openxmlformats.org/drawingml/2006/wordprocessingDrawing" xmlns:w10="urn:schemas-microsoft-com:office:word" xmlns:w="http://schemas.openxmlformats.org/wordprocessingml/2006/main" xmlns:w14="http://schemas.microsoft.com/office/word/2010/wordml" xmlns:w15="http://schemas.microsoft.com/office/word/2012/wordml" xmlns:w16se="http://schemas.microsoft.com/office/word/2015/wordml/symex" xmlns:wpg="http://schemas.microsoft.com/office/word/2010/wordprocessingGroup" xmlns:wpi="http://schemas.microsoft.com/office/word/2010/wordprocessingInk" xmlns:wne="http://schemas.microsoft.com/office/word/2006/wordml" xmlns:wps="http://schemas.microsoft.com/office/word/2010/wordprocessingShape" mc:Ignorable="w14 w15 w16se wp14">
   <w:body>
+    <w:p>
+      <w:pPr>
+        <w:rPr>
+          <w:rFonts w:ascii="Times New Roman" w:hAnsi="Times New Roman" w:cs="Times New Roman"/>
+          <w:sz w:val="24"/>
+          <w:szCs w:val="24"/>
+        </w:rPr>
+      </w:pPr>
+      <w:r>
+        <w:rPr>
+          <w:rFonts w:ascii="Times New Roman" w:hAnsi="Times New Roman" w:cs="Times New Roman"/>
+          <w:sz w:val="24"/>
+          <w:szCs w:val="24"/>
+        </w:rPr>
+        <w:t>How can you contribute to the conquest game?</w:t>
+      </w:r>
+    </w:p>
     <w:p>
       <w:pPr>
         <w:rPr>
@@ -225,7 +242,15 @@
           <w:sz w:val="24"/>
           <w:szCs w:val="24"/>
         </w:rPr>
-        <w:t xml:space="preserve">For particularly hard or easy questions, you can add the words </w:t>
+        <w:t>Optionally, f</w:t>
+      </w:r>
+      <w:r>
+        <w:rPr>
+          <w:rFonts w:ascii="Times New Roman" w:hAnsi="Times New Roman" w:cs="Times New Roman"/>
+          <w:sz w:val="24"/>
+          <w:szCs w:val="24"/>
+        </w:rPr>
+        <w:t xml:space="preserve">or particularly hard or easy questions, you can add the words </w:t>
       </w:r>
       <w:r>
         <w:rPr>
@@ -274,6 +299,7 @@
       <w:r>
         <w:rPr>
           <w:rFonts w:ascii="Times New Roman" w:hAnsi="Times New Roman" w:cs="Times New Roman"/>
+          <w:noProof/>
           <w:sz w:val="24"/>
           <w:szCs w:val="24"/>
         </w:rPr>
@@ -337,29 +363,426 @@
           <w:rFonts w:ascii="Times New Roman" w:hAnsi="Times New Roman" w:cs="Times New Roman"/>
           <w:sz w:val="24"/>
           <w:szCs w:val="24"/>
+        </w:rPr>
+      </w:pPr>
+    </w:p>
+    <w:p>
+      <w:pPr>
+        <w:rPr>
+          <w:rFonts w:ascii="Times New Roman" w:hAnsi="Times New Roman" w:cs="Times New Roman"/>
+          <w:sz w:val="24"/>
+          <w:szCs w:val="24"/>
+        </w:rPr>
+      </w:pPr>
+      <w:r>
+        <w:rPr>
+          <w:rFonts w:ascii="Times New Roman" w:hAnsi="Times New Roman" w:cs="Times New Roman"/>
+          <w:sz w:val="24"/>
+          <w:szCs w:val="24"/>
+        </w:rPr>
+        <w:t xml:space="preserve">Avoid picking questions </w:t>
+      </w:r>
+      <w:r>
+        <w:rPr>
+          <w:rFonts w:ascii="Times New Roman" w:hAnsi="Times New Roman" w:cs="Times New Roman"/>
+          <w:sz w:val="24"/>
+          <w:szCs w:val="24"/>
+        </w:rPr>
+        <w:t>whose solution is easy to guess.</w:t>
+      </w:r>
+    </w:p>
+    <w:p>
+      <w:pPr>
+        <w:rPr>
+          <w:rFonts w:ascii="Times New Roman" w:hAnsi="Times New Roman" w:cs="Times New Roman"/>
+          <w:sz w:val="24"/>
+          <w:szCs w:val="24"/>
+        </w:rPr>
+      </w:pPr>
+    </w:p>
+    <w:p>
+      <w:pPr>
+        <w:rPr>
+          <w:rFonts w:ascii="Times New Roman" w:hAnsi="Times New Roman" w:cs="Times New Roman"/>
+          <w:sz w:val="24"/>
+          <w:szCs w:val="24"/>
           <w:u w:val="single"/>
         </w:rPr>
       </w:pPr>
-      <w:r>
-        <w:rPr>
-          <w:rFonts w:ascii="Times New Roman" w:hAnsi="Times New Roman" w:cs="Times New Roman"/>
-          <w:sz w:val="24"/>
-          <w:szCs w:val="24"/>
-          <w:u w:val="single"/>
-        </w:rPr>
-        <w:t xml:space="preserve">Avoid picking questions </w:t>
-      </w:r>
-      <w:r>
-        <w:rPr>
-          <w:rFonts w:ascii="Times New Roman" w:hAnsi="Times New Roman" w:cs="Times New Roman"/>
-          <w:sz w:val="24"/>
-          <w:szCs w:val="24"/>
-          <w:u w:val="single"/>
-        </w:rPr>
-        <w:t>whose solution is easy to guess.</w:t>
+    </w:p>
+    <w:p>
+      <w:pPr>
+        <w:tabs>
+          <w:tab w:val="right" w:pos="10773"/>
+        </w:tabs>
+        <w:rPr>
+          <w:rFonts w:ascii="Times New Roman" w:hAnsi="Times New Roman" w:cs="Times New Roman"/>
+          <w:i/>
+          <w:sz w:val="18"/>
+          <w:szCs w:val="24"/>
+        </w:rPr>
+      </w:pPr>
+      <w:r>
+        <w:rPr>
+          <w:rFonts w:ascii="Times New Roman" w:hAnsi="Times New Roman" w:cs="Times New Roman"/>
+          <w:sz w:val="24"/>
+          <w:szCs w:val="24"/>
+        </w:rPr>
+        <w:t>Evaluation</w:t>
+      </w:r>
+      <w:r>
+        <w:rPr>
+          <w:rFonts w:ascii="Times New Roman" w:hAnsi="Times New Roman" w:cs="Times New Roman"/>
+          <w:sz w:val="24"/>
+          <w:szCs w:val="24"/>
+        </w:rPr>
+        <w:t xml:space="preserve"> and accuracy</w:t>
+      </w:r>
+      <w:r>
+        <w:rPr>
+          <w:rFonts w:ascii="Times New Roman" w:hAnsi="Times New Roman" w:cs="Times New Roman"/>
+          <w:sz w:val="24"/>
+          <w:szCs w:val="24"/>
+        </w:rPr>
+        <w:t xml:space="preserve"> rules</w:t>
+      </w:r>
+      <w:r>
+        <w:rPr>
+          <w:rFonts w:ascii="Times New Roman" w:hAnsi="Times New Roman" w:cs="Times New Roman"/>
+          <w:sz w:val="24"/>
+          <w:szCs w:val="24"/>
+        </w:rPr>
+        <w:t>:</w:t>
+      </w:r>
+      <w:r>
+        <w:rPr>
+          <w:rFonts w:ascii="Times New Roman" w:hAnsi="Times New Roman" w:cs="Times New Roman"/>
+          <w:sz w:val="24"/>
+          <w:szCs w:val="24"/>
+        </w:rPr>
+        <w:t xml:space="preserve"> </w:t>
+      </w:r>
+      <w:r>
+        <w:rPr>
+          <w:rFonts w:ascii="Times New Roman" w:hAnsi="Times New Roman" w:cs="Times New Roman"/>
+          <w:b/>
+          <w:sz w:val="24"/>
+          <w:szCs w:val="24"/>
+        </w:rPr>
+        <w:tab/>
+      </w:r>
+      <w:r>
+        <w:rPr>
+          <w:rFonts w:ascii="Times New Roman" w:hAnsi="Times New Roman" w:cs="Times New Roman"/>
+          <w:i/>
+          <w:sz w:val="18"/>
+          <w:szCs w:val="24"/>
+        </w:rPr>
+        <w:t>(T</w:t>
+      </w:r>
+      <w:r>
+        <w:rPr>
+          <w:rFonts w:ascii="Times New Roman" w:hAnsi="Times New Roman" w:cs="Times New Roman"/>
+          <w:i/>
+          <w:sz w:val="18"/>
+          <w:szCs w:val="24"/>
+        </w:rPr>
+        <w:t>he accuracy</w:t>
+      </w:r>
+      <w:r>
+        <w:rPr>
+          <w:rFonts w:ascii="Times New Roman" w:hAnsi="Times New Roman" w:cs="Times New Roman"/>
+          <w:i/>
+          <w:sz w:val="18"/>
+          <w:szCs w:val="24"/>
+        </w:rPr>
+        <w:t xml:space="preserve"> </w:t>
+      </w:r>
+      <w:r>
+        <w:rPr>
+          <w:rFonts w:ascii="Times New Roman" w:hAnsi="Times New Roman" w:cs="Times New Roman"/>
+          <w:i/>
+          <w:sz w:val="18"/>
+          <w:szCs w:val="24"/>
+        </w:rPr>
+        <w:t>rules can be changed</w:t>
       </w:r>
       <w:bookmarkStart w:id="0" w:name="_GoBack"/>
       <w:bookmarkEnd w:id="0"/>
+      <w:r>
+        <w:rPr>
+          <w:rFonts w:ascii="Times New Roman" w:hAnsi="Times New Roman" w:cs="Times New Roman"/>
+          <w:i/>
+          <w:sz w:val="18"/>
+          <w:szCs w:val="24"/>
+        </w:rPr>
+        <w:t xml:space="preserve"> if you do not agree with them.)</w:t>
+      </w:r>
+    </w:p>
+    <w:p>
+      <w:pPr>
+        <w:tabs>
+          <w:tab w:val="right" w:pos="10773"/>
+        </w:tabs>
+        <w:rPr>
+          <w:rFonts w:ascii="Times New Roman" w:hAnsi="Times New Roman" w:cs="Times New Roman"/>
+          <w:i/>
+          <w:sz w:val="18"/>
+          <w:szCs w:val="24"/>
+        </w:rPr>
+      </w:pPr>
+      <w:r>
+        <w:rPr>
+          <w:rFonts w:ascii="Times New Roman" w:hAnsi="Times New Roman" w:cs="Times New Roman"/>
+          <w:sz w:val="24"/>
+          <w:szCs w:val="24"/>
+        </w:rPr>
+        <w:t>For integers</w:t>
+      </w:r>
+      <w:r>
+        <w:rPr>
+          <w:rFonts w:ascii="Times New Roman" w:hAnsi="Times New Roman" w:cs="Times New Roman"/>
+          <w:sz w:val="24"/>
+          <w:szCs w:val="24"/>
+        </w:rPr>
+        <w:t>,</w:t>
+      </w:r>
+      <w:r>
+        <w:rPr>
+          <w:rFonts w:ascii="Times New Roman" w:hAnsi="Times New Roman" w:cs="Times New Roman"/>
+          <w:sz w:val="24"/>
+          <w:szCs w:val="24"/>
+        </w:rPr>
+        <w:t xml:space="preserve"> the students must provide the exact </w:t>
+      </w:r>
+      <w:r>
+        <w:rPr>
+          <w:rFonts w:ascii="Times New Roman" w:hAnsi="Times New Roman" w:cs="Times New Roman"/>
+          <w:sz w:val="24"/>
+          <w:szCs w:val="24"/>
+        </w:rPr>
+        <w:t>answer</w:t>
+      </w:r>
+      <w:r>
+        <w:rPr>
+          <w:rFonts w:ascii="Times New Roman" w:hAnsi="Times New Roman" w:cs="Times New Roman"/>
+          <w:sz w:val="24"/>
+          <w:szCs w:val="24"/>
+        </w:rPr>
+        <w:t>.</w:t>
+      </w:r>
+      <w:r>
+        <w:rPr>
+          <w:rFonts w:ascii="Times New Roman" w:hAnsi="Times New Roman" w:cs="Times New Roman"/>
+          <w:sz w:val="24"/>
+          <w:szCs w:val="24"/>
+        </w:rPr>
+        <w:t xml:space="preserve"> </w:t>
+      </w:r>
+      <w:r>
+        <w:rPr>
+          <w:rFonts w:ascii="Times New Roman" w:hAnsi="Times New Roman" w:cs="Times New Roman"/>
+          <w:sz w:val="24"/>
+          <w:szCs w:val="24"/>
+        </w:rPr>
+        <w:tab/>
+      </w:r>
+      <w:r>
+        <w:rPr>
+          <w:rFonts w:ascii="Times New Roman" w:hAnsi="Times New Roman" w:cs="Times New Roman"/>
+          <w:i/>
+          <w:sz w:val="18"/>
+          <w:szCs w:val="24"/>
+        </w:rPr>
+        <w:t>(So 1.999</w:t>
+      </w:r>
+      <w:r>
+        <w:rPr>
+          <w:rFonts w:ascii="Times New Roman" w:hAnsi="Times New Roman" w:cs="Times New Roman"/>
+          <w:i/>
+          <w:sz w:val="18"/>
+          <w:szCs w:val="24"/>
+        </w:rPr>
+        <w:t xml:space="preserve"> </w:t>
+      </w:r>
+      <w:r>
+        <w:rPr>
+          <w:rFonts w:ascii="Times New Roman" w:hAnsi="Times New Roman" w:cs="Times New Roman"/>
+          <w:i/>
+          <w:sz w:val="18"/>
+          <w:szCs w:val="24"/>
+        </w:rPr>
+        <w:t xml:space="preserve">is </w:t>
+      </w:r>
+      <w:r>
+        <w:rPr>
+          <w:rFonts w:ascii="Times New Roman" w:hAnsi="Times New Roman" w:cs="Times New Roman"/>
+          <w:i/>
+          <w:sz w:val="18"/>
+          <w:szCs w:val="24"/>
+        </w:rPr>
+        <w:t>not</w:t>
+      </w:r>
+      <w:r>
+        <w:rPr>
+          <w:rFonts w:ascii="Times New Roman" w:hAnsi="Times New Roman" w:cs="Times New Roman"/>
+          <w:i/>
+          <w:sz w:val="18"/>
+          <w:szCs w:val="24"/>
+        </w:rPr>
+        <w:t xml:space="preserve"> accepted as 2</w:t>
+      </w:r>
+      <w:r>
+        <w:rPr>
+          <w:rFonts w:ascii="Times New Roman" w:hAnsi="Times New Roman" w:cs="Times New Roman"/>
+          <w:i/>
+          <w:sz w:val="18"/>
+          <w:szCs w:val="24"/>
+        </w:rPr>
+        <w:t xml:space="preserve">, and 27800 is </w:t>
+      </w:r>
+      <w:r>
+        <w:rPr>
+          <w:rFonts w:ascii="Times New Roman" w:hAnsi="Times New Roman" w:cs="Times New Roman"/>
+          <w:i/>
+          <w:sz w:val="18"/>
+          <w:szCs w:val="24"/>
+        </w:rPr>
+        <w:t>not</w:t>
+      </w:r>
+      <w:r>
+        <w:rPr>
+          <w:rFonts w:ascii="Times New Roman" w:hAnsi="Times New Roman" w:cs="Times New Roman"/>
+          <w:i/>
+          <w:sz w:val="18"/>
+          <w:szCs w:val="24"/>
+        </w:rPr>
+        <w:t xml:space="preserve"> accepted as 27835</w:t>
+      </w:r>
+      <w:r>
+        <w:rPr>
+          <w:rFonts w:ascii="Times New Roman" w:hAnsi="Times New Roman" w:cs="Times New Roman"/>
+          <w:i/>
+          <w:sz w:val="18"/>
+          <w:szCs w:val="24"/>
+        </w:rPr>
+        <w:t>.</w:t>
+      </w:r>
+      <w:r>
+        <w:rPr>
+          <w:rFonts w:ascii="Times New Roman" w:hAnsi="Times New Roman" w:cs="Times New Roman"/>
+          <w:i/>
+          <w:sz w:val="18"/>
+          <w:szCs w:val="24"/>
+        </w:rPr>
+        <w:t>)</w:t>
+      </w:r>
+    </w:p>
+    <w:p>
+      <w:pPr>
+        <w:tabs>
+          <w:tab w:val="right" w:pos="10773"/>
+        </w:tabs>
+        <w:rPr>
+          <w:rFonts w:ascii="Times New Roman" w:hAnsi="Times New Roman" w:cs="Times New Roman"/>
+          <w:sz w:val="18"/>
+          <w:szCs w:val="18"/>
+        </w:rPr>
+      </w:pPr>
+      <w:r>
+        <w:rPr>
+          <w:rFonts w:ascii="Times New Roman" w:hAnsi="Times New Roman" w:cs="Times New Roman"/>
+          <w:sz w:val="24"/>
+          <w:szCs w:val="24"/>
+        </w:rPr>
+        <w:t xml:space="preserve">For decimals, </w:t>
+      </w:r>
+      <w:r>
+        <w:rPr>
+          <w:rFonts w:ascii="Times New Roman" w:hAnsi="Times New Roman" w:cs="Times New Roman"/>
+          <w:sz w:val="24"/>
+          <w:szCs w:val="24"/>
+        </w:rPr>
+        <w:t>their answer must be correct to at least</w:t>
+      </w:r>
+      <w:r>
+        <w:rPr>
+          <w:rFonts w:ascii="Times New Roman" w:hAnsi="Times New Roman" w:cs="Times New Roman"/>
+          <w:sz w:val="24"/>
+          <w:szCs w:val="24"/>
+        </w:rPr>
+        <w:t xml:space="preserve"> 3 significant figures.</w:t>
+      </w:r>
+      <w:r>
+        <w:rPr>
+          <w:rFonts w:ascii="Times New Roman" w:hAnsi="Times New Roman" w:cs="Times New Roman"/>
+          <w:sz w:val="24"/>
+          <w:szCs w:val="24"/>
+        </w:rPr>
+        <w:t xml:space="preserve"> </w:t>
+      </w:r>
+      <w:r>
+        <w:rPr>
+          <w:rFonts w:ascii="Times New Roman" w:hAnsi="Times New Roman" w:cs="Times New Roman"/>
+          <w:sz w:val="24"/>
+          <w:szCs w:val="24"/>
+        </w:rPr>
+        <w:tab/>
+      </w:r>
+      <w:r>
+        <w:rPr>
+          <w:rFonts w:ascii="Times New Roman" w:hAnsi="Times New Roman" w:cs="Times New Roman"/>
+          <w:i/>
+          <w:sz w:val="18"/>
+          <w:szCs w:val="18"/>
+        </w:rPr>
+        <w:t>(So 1.829</w:t>
+      </w:r>
+      <w:r>
+        <w:rPr>
+          <w:rFonts w:ascii="Times New Roman" w:hAnsi="Times New Roman" w:cs="Times New Roman"/>
+          <w:i/>
+          <w:sz w:val="18"/>
+          <w:szCs w:val="18"/>
+        </w:rPr>
+        <w:t xml:space="preserve"> </w:t>
+      </w:r>
+      <w:r>
+        <w:rPr>
+          <w:rFonts w:ascii="Times New Roman" w:hAnsi="Times New Roman" w:cs="Times New Roman"/>
+          <w:i/>
+          <w:sz w:val="18"/>
+          <w:szCs w:val="18"/>
+        </w:rPr>
+        <w:t>is accepted as 1.</w:t>
+      </w:r>
+      <w:r>
+        <w:rPr>
+          <w:rFonts w:ascii="Times New Roman" w:hAnsi="Times New Roman" w:cs="Times New Roman"/>
+          <w:i/>
+          <w:sz w:val="18"/>
+          <w:szCs w:val="18"/>
+        </w:rPr>
+        <w:t>83</w:t>
+      </w:r>
+      <w:r>
+        <w:rPr>
+          <w:rFonts w:ascii="Times New Roman" w:hAnsi="Times New Roman" w:cs="Times New Roman"/>
+          <w:i/>
+          <w:sz w:val="18"/>
+          <w:szCs w:val="18"/>
+        </w:rPr>
+        <w:t>.</w:t>
+      </w:r>
+      <w:r>
+        <w:rPr>
+          <w:rFonts w:ascii="Times New Roman" w:hAnsi="Times New Roman" w:cs="Times New Roman"/>
+          <w:i/>
+          <w:sz w:val="18"/>
+          <w:szCs w:val="18"/>
+        </w:rPr>
+        <w:t>)</w:t>
+      </w:r>
     </w:p>
     <w:p>
       <w:pPr>
@@ -377,113 +800,466 @@
           <w:sz w:val="24"/>
           <w:szCs w:val="24"/>
         </w:rPr>
-        <w:t>Evaluation:</w:t>
-      </w:r>
-    </w:p>
-    <w:p>
-      <w:pPr>
-        <w:rPr>
-          <w:rFonts w:ascii="Times New Roman" w:hAnsi="Times New Roman" w:cs="Times New Roman"/>
-          <w:sz w:val="24"/>
-          <w:szCs w:val="24"/>
-        </w:rPr>
-      </w:pPr>
-      <w:r>
-        <w:rPr>
-          <w:rFonts w:ascii="Times New Roman" w:hAnsi="Times New Roman" w:cs="Times New Roman"/>
-          <w:sz w:val="24"/>
-          <w:szCs w:val="24"/>
-        </w:rPr>
-        <w:t>For integers</w:t>
-      </w:r>
-      <w:r>
-        <w:rPr>
-          <w:rFonts w:ascii="Times New Roman" w:hAnsi="Times New Roman" w:cs="Times New Roman"/>
-          <w:sz w:val="24"/>
-          <w:szCs w:val="24"/>
-        </w:rPr>
-        <w:t>,</w:t>
-      </w:r>
-      <w:r>
-        <w:rPr>
-          <w:rFonts w:ascii="Times New Roman" w:hAnsi="Times New Roman" w:cs="Times New Roman"/>
-          <w:sz w:val="24"/>
-          <w:szCs w:val="24"/>
-        </w:rPr>
-        <w:t xml:space="preserve"> the students must provide the exact </w:t>
-      </w:r>
-      <w:r>
-        <w:rPr>
-          <w:rFonts w:ascii="Times New Roman" w:hAnsi="Times New Roman" w:cs="Times New Roman"/>
-          <w:sz w:val="24"/>
-          <w:szCs w:val="24"/>
-        </w:rPr>
-        <w:t>answer</w:t>
-      </w:r>
-      <w:r>
-        <w:rPr>
-          <w:rFonts w:ascii="Times New Roman" w:hAnsi="Times New Roman" w:cs="Times New Roman"/>
-          <w:sz w:val="24"/>
-          <w:szCs w:val="24"/>
-        </w:rPr>
-        <w:t>.</w:t>
-      </w:r>
-      <w:r>
-        <w:rPr>
-          <w:rFonts w:ascii="Times New Roman" w:hAnsi="Times New Roman" w:cs="Times New Roman"/>
-          <w:sz w:val="24"/>
-          <w:szCs w:val="24"/>
-        </w:rPr>
-        <w:t xml:space="preserve"> (So 1.9999 </w:t>
-      </w:r>
-      <w:r>
-        <w:rPr>
-          <w:rFonts w:ascii="Times New Roman" w:hAnsi="Times New Roman" w:cs="Times New Roman"/>
-          <w:sz w:val="24"/>
-          <w:szCs w:val="24"/>
-        </w:rPr>
-        <w:t>is NOT accepted as 2</w:t>
-      </w:r>
-      <w:r>
-        <w:rPr>
-          <w:rFonts w:ascii="Times New Roman" w:hAnsi="Times New Roman" w:cs="Times New Roman"/>
-          <w:sz w:val="24"/>
-          <w:szCs w:val="24"/>
-        </w:rPr>
-        <w:t>)</w:t>
-      </w:r>
-    </w:p>
-    <w:p>
-      <w:pPr>
-        <w:rPr>
-          <w:rFonts w:ascii="Times New Roman" w:hAnsi="Times New Roman" w:cs="Times New Roman"/>
-          <w:sz w:val="24"/>
-          <w:szCs w:val="24"/>
-        </w:rPr>
-      </w:pPr>
-      <w:r>
-        <w:rPr>
-          <w:rFonts w:ascii="Times New Roman" w:hAnsi="Times New Roman" w:cs="Times New Roman"/>
-          <w:sz w:val="24"/>
-          <w:szCs w:val="24"/>
-        </w:rPr>
-        <w:t>For decimals, they can round their answer to at least 3 significant figures.</w:t>
-      </w:r>
-      <w:r>
-        <w:rPr>
-          <w:rFonts w:ascii="Times New Roman" w:hAnsi="Times New Roman" w:cs="Times New Roman"/>
-          <w:sz w:val="24"/>
-          <w:szCs w:val="24"/>
-        </w:rPr>
-        <w:t xml:space="preserve"> (So 1.49999 </w:t>
-      </w:r>
-      <w:r>
-        <w:rPr>
-          <w:rFonts w:ascii="Times New Roman" w:hAnsi="Times New Roman" w:cs="Times New Roman"/>
-          <w:sz w:val="24"/>
-          <w:szCs w:val="24"/>
-        </w:rPr>
-        <w:t>is accepted as 1.</w:t>
+        <w:br w:type="page"/>
+      </w:r>
+    </w:p>
+    <w:p>
+      <w:pPr>
+        <w:rPr>
+          <w:rFonts w:ascii="Times New Roman" w:hAnsi="Times New Roman" w:cs="Times New Roman"/>
+          <w:b/>
+          <w:sz w:val="24"/>
+          <w:szCs w:val="24"/>
+        </w:rPr>
+      </w:pPr>
+      <w:r>
+        <w:rPr>
+          <w:rFonts w:ascii="Times New Roman" w:hAnsi="Times New Roman" w:cs="Times New Roman"/>
+          <w:b/>
+          <w:sz w:val="24"/>
+          <w:szCs w:val="24"/>
+        </w:rPr>
+        <w:lastRenderedPageBreak/>
+        <w:t>Creating maps:</w:t>
+      </w:r>
+    </w:p>
+    <w:p>
+      <w:pPr>
+        <w:pStyle w:val="ListParagraph"/>
+        <w:numPr>
+          <w:ilvl w:val="0"/>
+          <w:numId w:val="3"/>
+        </w:numPr>
+        <w:rPr>
+          <w:rFonts w:ascii="Times New Roman" w:hAnsi="Times New Roman" w:cs="Times New Roman"/>
+          <w:sz w:val="24"/>
+          <w:szCs w:val="24"/>
+        </w:rPr>
+      </w:pPr>
+      <w:r>
+        <w:rPr>
+          <w:rFonts w:ascii="Times New Roman" w:hAnsi="Times New Roman" w:cs="Times New Roman"/>
+          <w:sz w:val="24"/>
+          <w:szCs w:val="24"/>
+        </w:rPr>
+        <w:t>For colored territories: a</w:t>
+      </w:r>
+      <w:r>
+        <w:rPr>
+          <w:rFonts w:ascii="Times New Roman" w:hAnsi="Times New Roman" w:cs="Times New Roman"/>
+          <w:sz w:val="24"/>
+          <w:szCs w:val="24"/>
+        </w:rPr>
+        <w:t xml:space="preserve"> 1</w:t>
+      </w:r>
+      <w:r>
+        <w:rPr>
+          <w:rFonts w:ascii="Times New Roman" w:hAnsi="Times New Roman" w:cs="Times New Roman"/>
+          <w:sz w:val="24"/>
+          <w:szCs w:val="24"/>
+        </w:rPr>
+        <w:t>560</w:t>
+      </w:r>
+      <w:r>
+        <w:rPr>
+          <w:rFonts w:ascii="Times New Roman" w:hAnsi="Times New Roman" w:cs="Times New Roman"/>
+          <w:sz w:val="24"/>
+          <w:szCs w:val="24"/>
+        </w:rPr>
+        <w:t>x840</w:t>
+      </w:r>
+      <w:r>
+        <w:rPr>
+          <w:rFonts w:ascii="Times New Roman" w:hAnsi="Times New Roman" w:cs="Times New Roman"/>
+          <w:sz w:val="24"/>
+          <w:szCs w:val="24"/>
+        </w:rPr>
+        <w:t xml:space="preserve"> </w:t>
+      </w:r>
+      <w:r>
+        <w:rPr>
+          <w:rFonts w:ascii="Times New Roman" w:hAnsi="Times New Roman" w:cs="Times New Roman"/>
+          <w:sz w:val="24"/>
+          <w:szCs w:val="24"/>
+        </w:rPr>
+        <w:t xml:space="preserve">blank map </w:t>
+      </w:r>
+      <w:r>
+        <w:rPr>
+          <w:rFonts w:ascii="Times New Roman" w:hAnsi="Times New Roman" w:cs="Times New Roman"/>
+          <w:sz w:val="24"/>
+          <w:szCs w:val="24"/>
+        </w:rPr>
+        <w:t xml:space="preserve">picture in PNG format with </w:t>
+      </w:r>
+      <w:r>
+        <w:rPr>
+          <w:rFonts w:ascii="Times New Roman" w:hAnsi="Times New Roman" w:cs="Times New Roman"/>
+          <w:b/>
+          <w:sz w:val="24"/>
+          <w:szCs w:val="24"/>
+        </w:rPr>
+        <w:t xml:space="preserve">only black and white </w:t>
+      </w:r>
+      <w:r>
+        <w:rPr>
+          <w:rFonts w:ascii="Times New Roman" w:hAnsi="Times New Roman" w:cs="Times New Roman"/>
+          <w:b/>
+          <w:sz w:val="24"/>
+          <w:szCs w:val="24"/>
+        </w:rPr>
+        <w:t>pixels</w:t>
+      </w:r>
+      <w:r>
+        <w:rPr>
+          <w:rFonts w:ascii="Times New Roman" w:hAnsi="Times New Roman" w:cs="Times New Roman"/>
+          <w:sz w:val="24"/>
+          <w:szCs w:val="24"/>
+        </w:rPr>
+        <w:t xml:space="preserve"> (no grayscale).</w:t>
+      </w:r>
+      <w:r>
+        <w:rPr>
+          <w:rFonts w:ascii="Times New Roman" w:hAnsi="Times New Roman" w:cs="Times New Roman"/>
+          <w:sz w:val="24"/>
+          <w:szCs w:val="24"/>
+        </w:rPr>
+        <w:t xml:space="preserve"> </w:t>
+      </w:r>
+      <w:r>
+        <w:rPr>
+          <w:rFonts w:ascii="Times New Roman" w:hAnsi="Times New Roman" w:cs="Times New Roman"/>
+          <w:sz w:val="24"/>
+          <w:szCs w:val="24"/>
+        </w:rPr>
+        <w:t>This will tell the game where the</w:t>
+      </w:r>
+      <w:r>
+        <w:rPr>
+          <w:rFonts w:ascii="Times New Roman" w:hAnsi="Times New Roman" w:cs="Times New Roman"/>
+          <w:sz w:val="24"/>
+          <w:szCs w:val="24"/>
+        </w:rPr>
+        <w:t xml:space="preserve"> borders of the territories are</w:t>
+      </w:r>
+      <w:r>
+        <w:rPr>
+          <w:rFonts w:ascii="Times New Roman" w:hAnsi="Times New Roman" w:cs="Times New Roman"/>
+          <w:sz w:val="24"/>
+          <w:szCs w:val="24"/>
+        </w:rPr>
+        <w:t xml:space="preserve"> so it can change their color.</w:t>
+      </w:r>
+    </w:p>
+    <w:p>
+      <w:pPr>
+        <w:pStyle w:val="ListParagraph"/>
+        <w:numPr>
+          <w:ilvl w:val="0"/>
+          <w:numId w:val="3"/>
+        </w:numPr>
+        <w:rPr>
+          <w:rFonts w:ascii="Times New Roman" w:hAnsi="Times New Roman" w:cs="Times New Roman"/>
+          <w:sz w:val="24"/>
+          <w:szCs w:val="24"/>
+        </w:rPr>
+      </w:pPr>
+      <w:r>
+        <w:rPr>
+          <w:rFonts w:ascii="Times New Roman" w:hAnsi="Times New Roman" w:cs="Times New Roman"/>
+          <w:sz w:val="24"/>
+          <w:szCs w:val="24"/>
+        </w:rPr>
+        <w:t>Opti</w:t>
+      </w:r>
+      <w:r>
+        <w:rPr>
+          <w:rFonts w:ascii="Times New Roman" w:hAnsi="Times New Roman" w:cs="Times New Roman"/>
+          <w:sz w:val="24"/>
+          <w:szCs w:val="24"/>
+        </w:rPr>
+        <w:t>o</w:t>
+      </w:r>
+      <w:r>
+        <w:rPr>
+          <w:rFonts w:ascii="Times New Roman" w:hAnsi="Times New Roman" w:cs="Times New Roman"/>
+          <w:sz w:val="24"/>
+          <w:szCs w:val="24"/>
+        </w:rPr>
+        <w:t xml:space="preserve">nally, another 1560x840 picture in PNG format with any graphics you wish to </w:t>
+      </w:r>
+      <w:r>
+        <w:rPr>
+          <w:rFonts w:ascii="Times New Roman" w:hAnsi="Times New Roman" w:cs="Times New Roman"/>
+          <w:sz w:val="24"/>
+          <w:szCs w:val="24"/>
+        </w:rPr>
+        <w:t>draw underneath the territories.</w:t>
+      </w:r>
+    </w:p>
+    <w:p>
+      <w:pPr>
+        <w:pStyle w:val="ListParagraph"/>
+        <w:numPr>
+          <w:ilvl w:val="0"/>
+          <w:numId w:val="3"/>
+        </w:numPr>
+        <w:rPr>
+          <w:rFonts w:ascii="Times New Roman" w:hAnsi="Times New Roman" w:cs="Times New Roman"/>
+          <w:sz w:val="24"/>
+          <w:szCs w:val="24"/>
+        </w:rPr>
+      </w:pPr>
+      <w:r>
+        <w:rPr>
+          <w:rFonts w:ascii="Times New Roman" w:hAnsi="Times New Roman" w:cs="Times New Roman"/>
+          <w:sz w:val="24"/>
+          <w:szCs w:val="24"/>
+        </w:rPr>
+        <w:t>For colored buttons:</w:t>
+      </w:r>
+      <w:r>
+        <w:rPr>
+          <w:rFonts w:ascii="Times New Roman" w:hAnsi="Times New Roman" w:cs="Times New Roman"/>
+          <w:sz w:val="24"/>
+          <w:szCs w:val="24"/>
+        </w:rPr>
+        <w:t xml:space="preserve"> only the second picture and ins</w:t>
+      </w:r>
+      <w:r>
+        <w:rPr>
+          <w:rFonts w:ascii="Times New Roman" w:hAnsi="Times New Roman" w:cs="Times New Roman"/>
+          <w:sz w:val="24"/>
+          <w:szCs w:val="24"/>
+        </w:rPr>
+        <w:t xml:space="preserve">tead of changing the color of </w:t>
+      </w:r>
+      <w:r>
+        <w:rPr>
+          <w:rFonts w:ascii="Times New Roman" w:hAnsi="Times New Roman" w:cs="Times New Roman"/>
+          <w:sz w:val="24"/>
+          <w:szCs w:val="24"/>
+        </w:rPr>
+        <w:t>territories,</w:t>
+      </w:r>
+      <w:r>
+        <w:rPr>
+          <w:rFonts w:ascii="Times New Roman" w:hAnsi="Times New Roman" w:cs="Times New Roman"/>
+          <w:sz w:val="24"/>
+          <w:szCs w:val="24"/>
+        </w:rPr>
+        <w:t xml:space="preserve"> the game can overlay colored buttons over them.</w:t>
+      </w:r>
+    </w:p>
+    <w:p>
+      <w:pPr>
+        <w:rPr>
+          <w:rFonts w:ascii="Times New Roman" w:hAnsi="Times New Roman" w:cs="Times New Roman"/>
+          <w:sz w:val="24"/>
+          <w:szCs w:val="24"/>
+        </w:rPr>
+      </w:pPr>
+      <w:r>
+        <w:rPr>
+          <w:rFonts w:ascii="Times New Roman" w:hAnsi="Times New Roman" w:cs="Times New Roman"/>
+          <w:sz w:val="24"/>
+          <w:szCs w:val="24"/>
+        </w:rPr>
+        <w:t xml:space="preserve">I will make a map editor in April that lets you </w:t>
+      </w:r>
+      <w:r>
+        <w:rPr>
+          <w:rFonts w:ascii="Times New Roman" w:hAnsi="Times New Roman" w:cs="Times New Roman"/>
+          <w:sz w:val="24"/>
+          <w:szCs w:val="24"/>
+        </w:rPr>
+        <w:t>place, name, and connect the territories on your picture.</w:t>
+      </w:r>
+    </w:p>
+    <w:p>
+      <w:pPr>
+        <w:rPr>
+          <w:rFonts w:ascii="Times New Roman" w:hAnsi="Times New Roman" w:cs="Times New Roman"/>
+          <w:sz w:val="24"/>
+          <w:szCs w:val="24"/>
+        </w:rPr>
+      </w:pPr>
+    </w:p>
+    <w:p>
+      <w:pPr>
+        <w:rPr>
+          <w:rFonts w:ascii="Times New Roman" w:hAnsi="Times New Roman" w:cs="Times New Roman"/>
+          <w:sz w:val="24"/>
+          <w:szCs w:val="24"/>
+        </w:rPr>
+      </w:pPr>
+      <w:r>
+        <w:rPr>
+          <w:rFonts w:ascii="Times New Roman" w:hAnsi="Times New Roman" w:cs="Times New Roman"/>
+          <w:sz w:val="24"/>
+          <w:szCs w:val="24"/>
+        </w:rPr>
+        <w:t xml:space="preserve">Example of </w:t>
+      </w:r>
+      <w:r>
+        <w:rPr>
+          <w:rFonts w:ascii="Times New Roman" w:hAnsi="Times New Roman" w:cs="Times New Roman"/>
+          <w:sz w:val="24"/>
+          <w:szCs w:val="24"/>
+        </w:rPr>
+        <w:t xml:space="preserve">a game </w:t>
+      </w:r>
+      <w:r>
+        <w:rPr>
+          <w:rFonts w:ascii="Times New Roman" w:hAnsi="Times New Roman" w:cs="Times New Roman"/>
+          <w:sz w:val="24"/>
+          <w:szCs w:val="24"/>
+        </w:rPr>
+        <w:t>map with colored territories:</w:t>
+      </w:r>
+    </w:p>
+    <w:p>
+      <w:pPr>
+        <w:rPr>
+          <w:rFonts w:ascii="Times New Roman" w:hAnsi="Times New Roman" w:cs="Times New Roman"/>
+          <w:sz w:val="24"/>
+          <w:szCs w:val="24"/>
+        </w:rPr>
+      </w:pPr>
+      <w:r>
+        <w:rPr>
+          <w:noProof/>
+        </w:rPr>
+        <w:drawing>
+          <wp:inline distT="0" distB="0" distL="0" distR="0" wp14:anchorId="2159616E" wp14:editId="7CFB7187">
+            <wp:extent cx="4895850" cy="2759808"/>
+            <wp:effectExtent l="0" t="0" r="0" b="2540"/>
+            <wp:docPr id="3" name="Picture 3"/>
+            <wp:cNvGraphicFramePr>
+              <a:graphicFrameLocks xmlns:a="http://schemas.openxmlformats.org/drawingml/2006/main" noChangeAspect="1"/>
+            </wp:cNvGraphicFramePr>
+            <a:graphic xmlns:a="http://schemas.openxmlformats.org/drawingml/2006/main">
+              <a:graphicData uri="http://schemas.openxmlformats.org/drawingml/2006/picture">
+                <pic:pic xmlns:pic="http://schemas.openxmlformats.org/drawingml/2006/picture">
+                  <pic:nvPicPr>
+                    <pic:cNvPr id="1" name=""/>
+                    <pic:cNvPicPr/>
+                  </pic:nvPicPr>
+                  <pic:blipFill>
+                    <a:blip r:embed="rId7"/>
+                    <a:stretch>
+                      <a:fillRect/>
+                    </a:stretch>
+                  </pic:blipFill>
+                  <pic:spPr>
+                    <a:xfrm>
+                      <a:off x="0" y="0"/>
+                      <a:ext cx="4936761" cy="2782870"/>
+                    </a:xfrm>
+                    <a:prstGeom prst="rect">
+                      <a:avLst/>
+                    </a:prstGeom>
+                  </pic:spPr>
+                </pic:pic>
+              </a:graphicData>
+            </a:graphic>
+          </wp:inline>
+        </w:drawing>
+      </w:r>
+    </w:p>
+    <w:p>
+      <w:pPr>
+        <w:rPr>
+          <w:rFonts w:ascii="Times New Roman" w:hAnsi="Times New Roman" w:cs="Times New Roman"/>
+          <w:sz w:val="24"/>
+          <w:szCs w:val="24"/>
+        </w:rPr>
+      </w:pPr>
+      <w:r>
+        <w:rPr>
+          <w:rFonts w:ascii="Times New Roman" w:hAnsi="Times New Roman" w:cs="Times New Roman"/>
+          <w:sz w:val="24"/>
+          <w:szCs w:val="24"/>
+        </w:rPr>
+        <w:t xml:space="preserve">Example of </w:t>
+      </w:r>
+      <w:r>
+        <w:rPr>
+          <w:rFonts w:ascii="Times New Roman" w:hAnsi="Times New Roman" w:cs="Times New Roman"/>
+          <w:sz w:val="24"/>
+          <w:szCs w:val="24"/>
+        </w:rPr>
+        <w:t xml:space="preserve">a game </w:t>
+      </w:r>
+      <w:r>
+        <w:rPr>
+          <w:rFonts w:ascii="Times New Roman" w:hAnsi="Times New Roman" w:cs="Times New Roman"/>
+          <w:sz w:val="24"/>
+          <w:szCs w:val="24"/>
+        </w:rPr>
+        <w:t>map with colored buttons:</w:t>
+      </w:r>
+    </w:p>
+    <w:p>
+      <w:pPr>
+        <w:rPr>
+          <w:rFonts w:ascii="Times New Roman" w:hAnsi="Times New Roman" w:cs="Times New Roman"/>
+          <w:sz w:val="24"/>
+          <w:szCs w:val="24"/>
+        </w:rPr>
+      </w:pPr>
+      <w:r>
+        <w:rPr>
+          <w:noProof/>
+        </w:rPr>
+        <w:drawing>
+          <wp:inline distT="0" distB="0" distL="0" distR="0" wp14:anchorId="3468E751" wp14:editId="377EEF29">
+            <wp:extent cx="5016500" cy="2822070"/>
+            <wp:effectExtent l="0" t="0" r="0" b="0"/>
+            <wp:docPr id="4" name="Picture 4"/>
+            <wp:cNvGraphicFramePr>
+              <a:graphicFrameLocks xmlns:a="http://schemas.openxmlformats.org/drawingml/2006/main" noChangeAspect="1"/>
+            </wp:cNvGraphicFramePr>
+            <a:graphic xmlns:a="http://schemas.openxmlformats.org/drawingml/2006/main">
+              <a:graphicData uri="http://schemas.openxmlformats.org/drawingml/2006/picture">
+                <pic:pic xmlns:pic="http://schemas.openxmlformats.org/drawingml/2006/picture">
+                  <pic:nvPicPr>
+                    <pic:cNvPr id="0" name="Picture 1"/>
+                    <pic:cNvPicPr>
+                      <a:picLocks noChangeAspect="1" noChangeArrowheads="1"/>
+                    </pic:cNvPicPr>
+                  </pic:nvPicPr>
+                  <pic:blipFill>
+                    <a:blip r:embed="rId8" cstate="print">
+                      <a:extLst>
+                        <a:ext uri="{28A0092B-C50C-407E-A947-70E740481C1C}">
+                          <a14:useLocalDpi xmlns:a14="http://schemas.microsoft.com/office/drawing/2010/main" val="0"/>
+                        </a:ext>
+                      </a:extLst>
+                    </a:blip>
+                    <a:srcRect/>
+                    <a:stretch>
+                      <a:fillRect/>
+                    </a:stretch>
+                  </pic:blipFill>
+                  <pic:spPr bwMode="auto">
+                    <a:xfrm>
+                      <a:off x="0" y="0"/>
+                      <a:ext cx="5058889" cy="2845916"/>
+                    </a:xfrm>
+                    <a:prstGeom prst="rect">
+                      <a:avLst/>
+                    </a:prstGeom>
+                    <a:noFill/>
+                    <a:ln>
+                      <a:noFill/>
+                    </a:ln>
+                  </pic:spPr>
+                </pic:pic>
+              </a:graphicData>
+            </a:graphic>
+          </wp:inline>
+        </w:drawing>
       </w:r>
     </w:p>
     <w:sectPr>
@@ -612,6 +1388,119 @@
     </w:lvl>
   </w:abstractNum>
   <w:abstractNum w:abstractNumId="1" w15:restartNumberingAfterBreak="0">
+    <w:nsid w:val="45307BC2"/>
+    <w:multiLevelType w:val="hybridMultilevel"/>
+    <w:tmpl w:val="233290A8"/>
+    <w:lvl w:ilvl="0" w:tplc="04090001">
+      <w:start w:val="1"/>
+      <w:numFmt w:val="bullet"/>
+      <w:lvlText w:val=""/>
+      <w:lvlJc w:val="left"/>
+      <w:pPr>
+        <w:ind w:left="720" w:hanging="360"/>
+      </w:pPr>
+      <w:rPr>
+        <w:rFonts w:ascii="Symbol" w:hAnsi="Symbol" w:hint="default"/>
+      </w:rPr>
+    </w:lvl>
+    <w:lvl w:ilvl="1" w:tplc="04090003" w:tentative="1">
+      <w:start w:val="1"/>
+      <w:numFmt w:val="bullet"/>
+      <w:lvlText w:val="o"/>
+      <w:lvlJc w:val="left"/>
+      <w:pPr>
+        <w:ind w:left="1440" w:hanging="360"/>
+      </w:pPr>
+      <w:rPr>
+        <w:rFonts w:ascii="Courier New" w:hAnsi="Courier New" w:cs="Courier New" w:hint="default"/>
+      </w:rPr>
+    </w:lvl>
+    <w:lvl w:ilvl="2" w:tplc="04090005" w:tentative="1">
+      <w:start w:val="1"/>
+      <w:numFmt w:val="bullet"/>
+      <w:lvlText w:val=""/>
+      <w:lvlJc w:val="left"/>
+      <w:pPr>
+        <w:ind w:left="2160" w:hanging="360"/>
+      </w:pPr>
+      <w:rPr>
+        <w:rFonts w:ascii="Wingdings" w:hAnsi="Wingdings" w:hint="default"/>
+      </w:rPr>
+    </w:lvl>
+    <w:lvl w:ilvl="3" w:tplc="04090001" w:tentative="1">
+      <w:start w:val="1"/>
+      <w:numFmt w:val="bullet"/>
+      <w:lvlText w:val=""/>
+      <w:lvlJc w:val="left"/>
+      <w:pPr>
+        <w:ind w:left="2880" w:hanging="360"/>
+      </w:pPr>
+      <w:rPr>
+        <w:rFonts w:ascii="Symbol" w:hAnsi="Symbol" w:hint="default"/>
+      </w:rPr>
+    </w:lvl>
+    <w:lvl w:ilvl="4" w:tplc="04090003" w:tentative="1">
+      <w:start w:val="1"/>
+      <w:numFmt w:val="bullet"/>
+      <w:lvlText w:val="o"/>
+      <w:lvlJc w:val="left"/>
+      <w:pPr>
+        <w:ind w:left="3600" w:hanging="360"/>
+      </w:pPr>
+      <w:rPr>
+        <w:rFonts w:ascii="Courier New" w:hAnsi="Courier New" w:cs="Courier New" w:hint="default"/>
+      </w:rPr>
+    </w:lvl>
+    <w:lvl w:ilvl="5" w:tplc="04090005" w:tentative="1">
+      <w:start w:val="1"/>
+      <w:numFmt w:val="bullet"/>
+      <w:lvlText w:val=""/>
+      <w:lvlJc w:val="left"/>
+      <w:pPr>
+        <w:ind w:left="4320" w:hanging="360"/>
+      </w:pPr>
+      <w:rPr>
+        <w:rFonts w:ascii="Wingdings" w:hAnsi="Wingdings" w:hint="default"/>
+      </w:rPr>
+    </w:lvl>
+    <w:lvl w:ilvl="6" w:tplc="04090001" w:tentative="1">
+      <w:start w:val="1"/>
+      <w:numFmt w:val="bullet"/>
+      <w:lvlText w:val=""/>
+      <w:lvlJc w:val="left"/>
+      <w:pPr>
+        <w:ind w:left="5040" w:hanging="360"/>
+      </w:pPr>
+      <w:rPr>
+        <w:rFonts w:ascii="Symbol" w:hAnsi="Symbol" w:hint="default"/>
+      </w:rPr>
+    </w:lvl>
+    <w:lvl w:ilvl="7" w:tplc="04090003" w:tentative="1">
+      <w:start w:val="1"/>
+      <w:numFmt w:val="bullet"/>
+      <w:lvlText w:val="o"/>
+      <w:lvlJc w:val="left"/>
+      <w:pPr>
+        <w:ind w:left="5760" w:hanging="360"/>
+      </w:pPr>
+      <w:rPr>
+        <w:rFonts w:ascii="Courier New" w:hAnsi="Courier New" w:cs="Courier New" w:hint="default"/>
+      </w:rPr>
+    </w:lvl>
+    <w:lvl w:ilvl="8" w:tplc="04090005" w:tentative="1">
+      <w:start w:val="1"/>
+      <w:numFmt w:val="bullet"/>
+      <w:lvlText w:val=""/>
+      <w:lvlJc w:val="left"/>
+      <w:pPr>
+        <w:ind w:left="6480" w:hanging="360"/>
+      </w:pPr>
+      <w:rPr>
+        <w:rFonts w:ascii="Wingdings" w:hAnsi="Wingdings" w:hint="default"/>
+      </w:rPr>
+    </w:lvl>
+  </w:abstractNum>
+  <w:abstractNum w:abstractNumId="2" w15:restartNumberingAfterBreak="0">
     <w:nsid w:val="67F311B5"/>
     <w:multiLevelType w:val="hybridMultilevel"/>
     <w:tmpl w:val="A27AC682"/>
@@ -704,6 +1593,9 @@
     <w:abstractNumId w:val="0"/>
   </w:num>
   <w:num w:numId="2">
+    <w:abstractNumId w:val="2"/>
+  </w:num>
+  <w:num w:numId="3">
     <w:abstractNumId w:val="1"/>
   </w:num>
 </w:numbering>

</xml_diff>

<commit_message>
loading circle is now tea mcolor
</commit_message>
<xml_diff>
--- a/docs/conquest/bankMaking.docx
+++ b/docs/conquest/bankMaking.docx
@@ -319,6 +319,7 @@
       <w:r>
         <w:rPr>
           <w:rFonts w:ascii="Times New Roman" w:hAnsi="Times New Roman" w:cs="Times New Roman"/>
+          <w:noProof/>
           <w:sz w:val="24"/>
           <w:szCs w:val="24"/>
         </w:rPr>
@@ -396,6 +397,51 @@
       <w:pPr>
         <w:rPr>
           <w:rFonts w:ascii="Times New Roman" w:hAnsi="Times New Roman" w:cs="Times New Roman"/>
+          <w:b/>
+          <w:i/>
+          <w:sz w:val="24"/>
+          <w:szCs w:val="24"/>
+        </w:rPr>
+      </w:pPr>
+      <w:bookmarkStart w:id="0" w:name="_GoBack"/>
+      <w:r>
+        <w:rPr>
+          <w:rFonts w:ascii="Times New Roman" w:hAnsi="Times New Roman" w:cs="Times New Roman"/>
+          <w:b/>
+          <w:i/>
+          <w:sz w:val="24"/>
+          <w:szCs w:val="24"/>
+        </w:rPr>
+        <w:t xml:space="preserve">Please add some redundancy. Either prepare a separate document with the </w:t>
+      </w:r>
+      <w:proofErr w:type="spellStart"/>
+      <w:r>
+        <w:rPr>
+          <w:rFonts w:ascii="Times New Roman" w:hAnsi="Times New Roman" w:cs="Times New Roman"/>
+          <w:b/>
+          <w:i/>
+          <w:sz w:val="24"/>
+          <w:szCs w:val="24"/>
+        </w:rPr>
+        <w:t>filenames+solutions</w:t>
+      </w:r>
+      <w:proofErr w:type="spellEnd"/>
+      <w:r>
+        <w:rPr>
+          <w:rFonts w:ascii="Times New Roman" w:hAnsi="Times New Roman" w:cs="Times New Roman"/>
+          <w:b/>
+          <w:i/>
+          <w:sz w:val="24"/>
+          <w:szCs w:val="24"/>
+        </w:rPr>
+        <w:t xml:space="preserve"> or just repeat the solution multiple times in the filename.</w:t>
+      </w:r>
+    </w:p>
+    <w:bookmarkEnd w:id="0"/>
+    <w:p>
+      <w:pPr>
+        <w:rPr>
+          <w:rFonts w:ascii="Times New Roman" w:hAnsi="Times New Roman" w:cs="Times New Roman"/>
           <w:sz w:val="24"/>
           <w:szCs w:val="24"/>
         </w:rPr>
@@ -1272,8 +1318,6 @@
           <w:szCs w:val="24"/>
         </w:rPr>
       </w:pPr>
-      <w:bookmarkStart w:id="0" w:name="_GoBack"/>
-      <w:bookmarkEnd w:id="0"/>
     </w:p>
     <w:p>
       <w:pPr>

</xml_diff>

<commit_message>
bucket update. TODO: json double check
</commit_message>
<xml_diff>
--- a/docs/conquest/bankMaking.docx
+++ b/docs/conquest/bankMaking.docx
@@ -1,6 +1,6 @@
 
 <file path=word/document.xml><?xml version="1.0" encoding="utf-8"?>
-<w:document xmlns:wpc="http://schemas.microsoft.com/office/word/2010/wordprocessingCanvas" xmlns:cx="http://schemas.microsoft.com/office/drawing/2014/chartex" xmlns:cx1="http://schemas.microsoft.com/office/drawing/2015/9/8/chartex" xmlns:mc="http://schemas.openxmlformats.org/markup-compatibility/2006" xmlns:o="urn:schemas-microsoft-com:office:office" xmlns:r="http://schemas.openxmlformats.org/officeDocument/2006/relationships" xmlns:m="http://schemas.openxmlformats.org/officeDocument/2006/math" xmlns:v="urn:schemas-microsoft-com:vml" xmlns:wp14="http://schemas.microsoft.com/office/word/2010/wordprocessingDrawing" xmlns:wp="http://schemas.openxmlformats.org/drawingml/2006/wordprocessingDrawing" xmlns:w10="urn:schemas-microsoft-com:office:word" xmlns:w="http://schemas.openxmlformats.org/wordprocessingml/2006/main" xmlns:w14="http://schemas.microsoft.com/office/word/2010/wordml" xmlns:w15="http://schemas.microsoft.com/office/word/2012/wordml" xmlns:w16se="http://schemas.microsoft.com/office/word/2015/wordml/symex" xmlns:wpg="http://schemas.microsoft.com/office/word/2010/wordprocessingGroup" xmlns:wpi="http://schemas.microsoft.com/office/word/2010/wordprocessingInk" xmlns:wne="http://schemas.microsoft.com/office/word/2006/wordml" xmlns:wps="http://schemas.microsoft.com/office/word/2010/wordprocessingShape" mc:Ignorable="w14 w15 w16se wp14">
+<w:document xmlns:wpc="http://schemas.microsoft.com/office/word/2010/wordprocessingCanvas" xmlns:cx="http://schemas.microsoft.com/office/drawing/2014/chartex" xmlns:cx1="http://schemas.microsoft.com/office/drawing/2015/9/8/chartex" xmlns:cx2="http://schemas.microsoft.com/office/drawing/2015/10/21/chartex" xmlns:cx3="http://schemas.microsoft.com/office/drawing/2016/5/9/chartex" xmlns:cx4="http://schemas.microsoft.com/office/drawing/2016/5/10/chartex" xmlns:cx5="http://schemas.microsoft.com/office/drawing/2016/5/11/chartex" xmlns:cx6="http://schemas.microsoft.com/office/drawing/2016/5/12/chartex" xmlns:cx7="http://schemas.microsoft.com/office/drawing/2016/5/13/chartex" xmlns:cx8="http://schemas.microsoft.com/office/drawing/2016/5/14/chartex" xmlns:mc="http://schemas.openxmlformats.org/markup-compatibility/2006" xmlns:aink="http://schemas.microsoft.com/office/drawing/2016/ink" xmlns:am3d="http://schemas.microsoft.com/office/drawing/2017/model3d" xmlns:o="urn:schemas-microsoft-com:office:office" xmlns:oel="http://schemas.microsoft.com/office/2019/extlst" xmlns:r="http://schemas.openxmlformats.org/officeDocument/2006/relationships" xmlns:m="http://schemas.openxmlformats.org/officeDocument/2006/math" xmlns:v="urn:schemas-microsoft-com:vml" xmlns:wp14="http://schemas.microsoft.com/office/word/2010/wordprocessingDrawing" xmlns:wp="http://schemas.openxmlformats.org/drawingml/2006/wordprocessingDrawing" xmlns:w10="urn:schemas-microsoft-com:office:word" xmlns:w="http://schemas.openxmlformats.org/wordprocessingml/2006/main" xmlns:w14="http://schemas.microsoft.com/office/word/2010/wordml" xmlns:w15="http://schemas.microsoft.com/office/word/2012/wordml" xmlns:w16cex="http://schemas.microsoft.com/office/word/2018/wordml/cex" xmlns:w16cid="http://schemas.microsoft.com/office/word/2016/wordml/cid" xmlns:w16="http://schemas.microsoft.com/office/word/2018/wordml" xmlns:w16du="http://schemas.microsoft.com/office/word/2023/wordml/word16du" xmlns:w16sdtdh="http://schemas.microsoft.com/office/word/2020/wordml/sdtdatahash" xmlns:w16sdtfl="http://schemas.microsoft.com/office/word/2024/wordml/sdtformatlock" xmlns:w16se="http://schemas.microsoft.com/office/word/2015/wordml/symex" xmlns:wpg="http://schemas.microsoft.com/office/word/2010/wordprocessingGroup" xmlns:wpi="http://schemas.microsoft.com/office/word/2010/wordprocessingInk" xmlns:wne="http://schemas.microsoft.com/office/word/2006/wordml" xmlns:wps="http://schemas.microsoft.com/office/word/2010/wordprocessingShape" mc:Ignorable="w14 w15 w16se w16cid w16 w16cex w16sdtdh w16sdtfl w16du wp14">
   <w:body>
     <w:p>
       <w:pPr>
@@ -136,9 +136,9 @@
           <w:szCs w:val="24"/>
         </w:rPr>
         <w:drawing>
-          <wp:inline distT="0" distB="0" distL="0" distR="0" wp14:anchorId="14212072" wp14:editId="79E21202">
-            <wp:extent cx="1437670" cy="688576"/>
-            <wp:effectExtent l="0" t="0" r="0" b="0"/>
+          <wp:inline distT="0" distB="0" distL="0" distR="0" wp14:anchorId="14212072" wp14:editId="0D16832A">
+            <wp:extent cx="1287780" cy="616786"/>
+            <wp:effectExtent l="0" t="0" r="7620" b="0"/>
             <wp:docPr id="1" name="Picture 1"/>
             <wp:cNvGraphicFramePr>
               <a:graphicFrameLocks xmlns:a="http://schemas.openxmlformats.org/drawingml/2006/main" noChangeAspect="1"/>
@@ -158,7 +158,7 @@
                   <pic:spPr bwMode="auto">
                     <a:xfrm>
                       <a:off x="0" y="0"/>
-                      <a:ext cx="1467911" cy="703060"/>
+                      <a:ext cx="1317793" cy="631161"/>
                     </a:xfrm>
                     <a:prstGeom prst="rect">
                       <a:avLst/>
@@ -187,23 +187,13 @@
           <w:szCs w:val="24"/>
         </w:rPr>
       </w:pPr>
-      <w:proofErr w:type="gramStart"/>
-      <w:r>
-        <w:rPr>
-          <w:rFonts w:ascii="Times New Roman" w:hAnsi="Times New Roman" w:cs="Times New Roman"/>
-          <w:sz w:val="24"/>
-          <w:szCs w:val="24"/>
-        </w:rPr>
-        <w:t>will</w:t>
-      </w:r>
-      <w:proofErr w:type="gramEnd"/>
-      <w:r>
-        <w:rPr>
-          <w:rFonts w:ascii="Times New Roman" w:hAnsi="Times New Roman" w:cs="Times New Roman"/>
-          <w:sz w:val="24"/>
-          <w:szCs w:val="24"/>
-        </w:rPr>
-        <w:t xml:space="preserve"> </w:t>
+      <w:r>
+        <w:rPr>
+          <w:rFonts w:ascii="Times New Roman" w:hAnsi="Times New Roman" w:cs="Times New Roman"/>
+          <w:sz w:val="24"/>
+          <w:szCs w:val="24"/>
+        </w:rPr>
+        <w:t xml:space="preserve">will </w:t>
       </w:r>
       <w:r>
         <w:rPr>
@@ -285,19 +275,8 @@
           <w:sz w:val="24"/>
           <w:szCs w:val="24"/>
         </w:rPr>
-        <w:t xml:space="preserve">easy, medium, moderate, </w:t>
-      </w:r>
-      <w:proofErr w:type="gramStart"/>
-      <w:r>
-        <w:rPr>
-          <w:rFonts w:ascii="Times New Roman" w:hAnsi="Times New Roman" w:cs="Times New Roman"/>
-          <w:b/>
-          <w:sz w:val="24"/>
-          <w:szCs w:val="24"/>
-        </w:rPr>
-        <w:t>hard</w:t>
-      </w:r>
-      <w:proofErr w:type="gramEnd"/>
+        <w:t>easy, medium, moderate, hard</w:t>
+      </w:r>
       <w:r>
         <w:rPr>
           <w:rFonts w:ascii="Times New Roman" w:hAnsi="Times New Roman" w:cs="Times New Roman"/>
@@ -324,9 +303,9 @@
           <w:szCs w:val="24"/>
         </w:rPr>
         <w:drawing>
-          <wp:inline distT="0" distB="0" distL="0" distR="0" wp14:anchorId="4ADF4388" wp14:editId="4982E929">
-            <wp:extent cx="1905000" cy="863512"/>
-            <wp:effectExtent l="0" t="0" r="0" b="0"/>
+          <wp:inline distT="0" distB="0" distL="0" distR="0" wp14:anchorId="4ADF4388" wp14:editId="0B2FA0A8">
+            <wp:extent cx="1638300" cy="742621"/>
+            <wp:effectExtent l="0" t="0" r="0" b="635"/>
             <wp:docPr id="5" name="Picture 5"/>
             <wp:cNvGraphicFramePr>
               <a:graphicFrameLocks xmlns:a="http://schemas.openxmlformats.org/drawingml/2006/main" noChangeAspect="1"/>
@@ -347,7 +326,7 @@
                   <pic:spPr>
                     <a:xfrm>
                       <a:off x="0" y="0"/>
-                      <a:ext cx="1945545" cy="881891"/>
+                      <a:ext cx="1699441" cy="770335"/>
                     </a:xfrm>
                     <a:prstGeom prst="rect">
                       <a:avLst/>
@@ -403,7 +382,6 @@
           <w:szCs w:val="24"/>
         </w:rPr>
       </w:pPr>
-      <w:bookmarkStart w:id="0" w:name="_GoBack"/>
       <w:r>
         <w:rPr>
           <w:rFonts w:ascii="Times New Roman" w:hAnsi="Times New Roman" w:cs="Times New Roman"/>
@@ -412,9 +390,8 @@
           <w:sz w:val="24"/>
           <w:szCs w:val="24"/>
         </w:rPr>
-        <w:t xml:space="preserve">Please add some redundancy. Either prepare a separate document with the </w:t>
-      </w:r>
-      <w:proofErr w:type="spellStart"/>
+        <w:t>Please add some redundancy. Either prepare a separate document with the filenames+solutions or just repeat the solution multiple times in the filename.</w:t>
+      </w:r>
       <w:r>
         <w:rPr>
           <w:rFonts w:ascii="Times New Roman" w:hAnsi="Times New Roman" w:cs="Times New Roman"/>
@@ -423,29 +400,38 @@
           <w:sz w:val="24"/>
           <w:szCs w:val="24"/>
         </w:rPr>
-        <w:t>filenames+solutions</w:t>
-      </w:r>
-      <w:proofErr w:type="spellEnd"/>
-      <w:r>
-        <w:rPr>
-          <w:rFonts w:ascii="Times New Roman" w:hAnsi="Times New Roman" w:cs="Times New Roman"/>
-          <w:b/>
-          <w:i/>
-          <w:sz w:val="24"/>
-          <w:szCs w:val="24"/>
-        </w:rPr>
-        <w:t xml:space="preserve"> or just repeat the solution multiple times in the filename.</w:t>
-      </w:r>
-    </w:p>
-    <w:bookmarkEnd w:id="0"/>
-    <w:p>
-      <w:pPr>
-        <w:rPr>
-          <w:rFonts w:ascii="Times New Roman" w:hAnsi="Times New Roman" w:cs="Times New Roman"/>
-          <w:sz w:val="24"/>
-          <w:szCs w:val="24"/>
-        </w:rPr>
-      </w:pPr>
+        <w:t xml:space="preserve"> </w:t>
+      </w:r>
+      <w:r>
+        <w:rPr>
+          <w:rFonts w:ascii="Times New Roman" w:hAnsi="Times New Roman" w:cs="Times New Roman"/>
+          <w:bCs/>
+          <w:i/>
+          <w:sz w:val="24"/>
+          <w:szCs w:val="24"/>
+        </w:rPr>
+        <w:t>During the game, we can easily invalidate any question there is an issue with, and clearly noting the question’s source will make it easy to review what was wrong with it afterwards (</w:t>
+      </w:r>
+      <w:r>
+        <w:rPr>
+          <w:rFonts w:ascii="Times New Roman" w:hAnsi="Times New Roman" w:cs="Times New Roman"/>
+          <w:bCs/>
+          <w:i/>
+          <w:sz w:val="24"/>
+          <w:szCs w:val="24"/>
+        </w:rPr>
+        <w:t xml:space="preserve">usual suspects: </w:t>
+      </w:r>
+      <w:r>
+        <w:rPr>
+          <w:rFonts w:ascii="Times New Roman" w:hAnsi="Times New Roman" w:cs="Times New Roman"/>
+          <w:bCs/>
+          <w:i/>
+          <w:sz w:val="24"/>
+          <w:szCs w:val="24"/>
+        </w:rPr>
+        <w:t>bad cropping, poor wording, wrong solution.).</w:t>
+      </w:r>
     </w:p>
     <w:p>
       <w:pPr>
@@ -471,15 +457,6 @@
         </w:rPr>
         <w:t>whose solution is easy to guess.</w:t>
       </w:r>
-    </w:p>
-    <w:p>
-      <w:pPr>
-        <w:rPr>
-          <w:rFonts w:ascii="Times New Roman" w:hAnsi="Times New Roman" w:cs="Times New Roman"/>
-          <w:sz w:val="24"/>
-          <w:szCs w:val="24"/>
-        </w:rPr>
-      </w:pPr>
     </w:p>
     <w:p>
       <w:pPr>
@@ -586,19 +563,8 @@
           <w:sz w:val="18"/>
           <w:szCs w:val="24"/>
         </w:rPr>
-        <w:t xml:space="preserve">rules </w:t>
-      </w:r>
-      <w:proofErr w:type="gramStart"/>
-      <w:r>
-        <w:rPr>
-          <w:rFonts w:ascii="Times New Roman" w:hAnsi="Times New Roman" w:cs="Times New Roman"/>
-          <w:i/>
-          <w:sz w:val="18"/>
-          <w:szCs w:val="24"/>
-        </w:rPr>
-        <w:t>can be changed</w:t>
-      </w:r>
-      <w:proofErr w:type="gramEnd"/>
+        <w:t>rules can be changed</w:t>
+      </w:r>
       <w:r>
         <w:rPr>
           <w:rFonts w:ascii="Times New Roman" w:hAnsi="Times New Roman" w:cs="Times New Roman"/>
@@ -625,158 +591,17 @@
         </w:tabs>
         <w:rPr>
           <w:rFonts w:ascii="Times New Roman" w:hAnsi="Times New Roman" w:cs="Times New Roman"/>
-          <w:i/>
-          <w:sz w:val="18"/>
-          <w:szCs w:val="24"/>
-        </w:rPr>
-      </w:pPr>
-      <w:r>
-        <w:rPr>
-          <w:rFonts w:ascii="Times New Roman" w:hAnsi="Times New Roman" w:cs="Times New Roman"/>
-          <w:sz w:val="24"/>
-          <w:szCs w:val="24"/>
-        </w:rPr>
-        <w:t>For integers</w:t>
-      </w:r>
-      <w:r>
-        <w:rPr>
-          <w:rFonts w:ascii="Times New Roman" w:hAnsi="Times New Roman" w:cs="Times New Roman"/>
-          <w:sz w:val="24"/>
-          <w:szCs w:val="24"/>
-        </w:rPr>
-        <w:t>,</w:t>
-      </w:r>
-      <w:r>
-        <w:rPr>
-          <w:rFonts w:ascii="Times New Roman" w:hAnsi="Times New Roman" w:cs="Times New Roman"/>
-          <w:sz w:val="24"/>
-          <w:szCs w:val="24"/>
-        </w:rPr>
-        <w:t xml:space="preserve"> the students must provide the exact </w:t>
-      </w:r>
-      <w:r>
-        <w:rPr>
-          <w:rFonts w:ascii="Times New Roman" w:hAnsi="Times New Roman" w:cs="Times New Roman"/>
-          <w:sz w:val="24"/>
-          <w:szCs w:val="24"/>
-        </w:rPr>
-        <w:t>answer</w:t>
-      </w:r>
-      <w:r>
-        <w:rPr>
-          <w:rFonts w:ascii="Times New Roman" w:hAnsi="Times New Roman" w:cs="Times New Roman"/>
-          <w:sz w:val="24"/>
-          <w:szCs w:val="24"/>
-        </w:rPr>
-        <w:t>.</w:t>
-      </w:r>
-      <w:r>
-        <w:rPr>
-          <w:rFonts w:ascii="Times New Roman" w:hAnsi="Times New Roman" w:cs="Times New Roman"/>
-          <w:sz w:val="24"/>
-          <w:szCs w:val="24"/>
-        </w:rPr>
-        <w:t xml:space="preserve"> </w:t>
-      </w:r>
-      <w:r>
-        <w:rPr>
-          <w:rFonts w:ascii="Times New Roman" w:hAnsi="Times New Roman" w:cs="Times New Roman"/>
-          <w:sz w:val="24"/>
-          <w:szCs w:val="24"/>
-        </w:rPr>
-        <w:tab/>
-      </w:r>
-      <w:r>
-        <w:rPr>
-          <w:rFonts w:ascii="Times New Roman" w:hAnsi="Times New Roman" w:cs="Times New Roman"/>
-          <w:i/>
-          <w:sz w:val="18"/>
-          <w:szCs w:val="24"/>
-        </w:rPr>
-        <w:t>(So 1.999</w:t>
-      </w:r>
-      <w:r>
-        <w:rPr>
-          <w:rFonts w:ascii="Times New Roman" w:hAnsi="Times New Roman" w:cs="Times New Roman"/>
-          <w:i/>
-          <w:sz w:val="18"/>
-          <w:szCs w:val="24"/>
-        </w:rPr>
-        <w:t xml:space="preserve"> </w:t>
-      </w:r>
-      <w:proofErr w:type="gramStart"/>
-      <w:r>
-        <w:rPr>
-          <w:rFonts w:ascii="Times New Roman" w:hAnsi="Times New Roman" w:cs="Times New Roman"/>
-          <w:i/>
-          <w:sz w:val="18"/>
-          <w:szCs w:val="24"/>
-        </w:rPr>
-        <w:t xml:space="preserve">is </w:t>
-      </w:r>
-      <w:r>
-        <w:rPr>
-          <w:rFonts w:ascii="Times New Roman" w:hAnsi="Times New Roman" w:cs="Times New Roman"/>
-          <w:i/>
-          <w:sz w:val="18"/>
-          <w:szCs w:val="24"/>
-        </w:rPr>
-        <w:t>not</w:t>
-      </w:r>
-      <w:r>
-        <w:rPr>
-          <w:rFonts w:ascii="Times New Roman" w:hAnsi="Times New Roman" w:cs="Times New Roman"/>
-          <w:i/>
-          <w:sz w:val="18"/>
-          <w:szCs w:val="24"/>
-        </w:rPr>
-        <w:t xml:space="preserve"> accepted</w:t>
-      </w:r>
-      <w:proofErr w:type="gramEnd"/>
-      <w:r>
-        <w:rPr>
-          <w:rFonts w:ascii="Times New Roman" w:hAnsi="Times New Roman" w:cs="Times New Roman"/>
-          <w:i/>
-          <w:sz w:val="18"/>
-          <w:szCs w:val="24"/>
-        </w:rPr>
-        <w:t xml:space="preserve"> as 2</w:t>
-      </w:r>
-      <w:r>
-        <w:rPr>
-          <w:rFonts w:ascii="Times New Roman" w:hAnsi="Times New Roman" w:cs="Times New Roman"/>
-          <w:i/>
-          <w:sz w:val="18"/>
-          <w:szCs w:val="24"/>
-        </w:rPr>
-        <w:t xml:space="preserve">, and 27800 is </w:t>
-      </w:r>
-      <w:r>
-        <w:rPr>
-          <w:rFonts w:ascii="Times New Roman" w:hAnsi="Times New Roman" w:cs="Times New Roman"/>
-          <w:i/>
-          <w:sz w:val="18"/>
-          <w:szCs w:val="24"/>
-        </w:rPr>
-        <w:t>not</w:t>
-      </w:r>
-      <w:r>
-        <w:rPr>
-          <w:rFonts w:ascii="Times New Roman" w:hAnsi="Times New Roman" w:cs="Times New Roman"/>
-          <w:i/>
-          <w:sz w:val="18"/>
-          <w:szCs w:val="24"/>
-        </w:rPr>
-        <w:t xml:space="preserve"> accepted as 27835</w:t>
-      </w:r>
-      <w:r>
-        <w:rPr>
-          <w:rFonts w:ascii="Times New Roman" w:hAnsi="Times New Roman" w:cs="Times New Roman"/>
-          <w:i/>
-          <w:sz w:val="18"/>
-          <w:szCs w:val="24"/>
-        </w:rPr>
-        <w:t>)</w:t>
+          <w:sz w:val="24"/>
+          <w:szCs w:val="24"/>
+        </w:rPr>
+      </w:pPr>
+      <w:r>
+        <w:rPr>
+          <w:rFonts w:ascii="Times New Roman" w:hAnsi="Times New Roman" w:cs="Times New Roman"/>
+          <w:sz w:val="24"/>
+          <w:szCs w:val="24"/>
+        </w:rPr>
+        <w:t>Let T be the solution the teacher gave in the filename, let S be the guess of the student.</w:t>
       </w:r>
     </w:p>
     <w:p>
@@ -786,124 +611,39 @@
         </w:tabs>
         <w:rPr>
           <w:rFonts w:ascii="Times New Roman" w:hAnsi="Times New Roman" w:cs="Times New Roman"/>
-          <w:i/>
-          <w:sz w:val="18"/>
-          <w:szCs w:val="18"/>
-        </w:rPr>
-      </w:pPr>
-      <w:r>
-        <w:rPr>
-          <w:rFonts w:ascii="Times New Roman" w:hAnsi="Times New Roman" w:cs="Times New Roman"/>
-          <w:sz w:val="24"/>
-          <w:szCs w:val="24"/>
-        </w:rPr>
-        <w:t xml:space="preserve">For decimals, </w:t>
-      </w:r>
-      <w:r>
-        <w:rPr>
-          <w:rFonts w:ascii="Times New Roman" w:hAnsi="Times New Roman" w:cs="Times New Roman"/>
-          <w:sz w:val="24"/>
-          <w:szCs w:val="24"/>
-        </w:rPr>
-        <w:t>their answer must be correct to at least</w:t>
-      </w:r>
-      <w:r>
-        <w:rPr>
-          <w:rFonts w:ascii="Times New Roman" w:hAnsi="Times New Roman" w:cs="Times New Roman"/>
-          <w:sz w:val="24"/>
-          <w:szCs w:val="24"/>
-        </w:rPr>
-        <w:t xml:space="preserve"> </w:t>
-      </w:r>
-      <w:proofErr w:type="gramStart"/>
-      <w:r>
-        <w:rPr>
-          <w:rFonts w:ascii="Times New Roman" w:hAnsi="Times New Roman" w:cs="Times New Roman"/>
-          <w:sz w:val="24"/>
-          <w:szCs w:val="24"/>
-        </w:rPr>
-        <w:t>3</w:t>
-      </w:r>
-      <w:proofErr w:type="gramEnd"/>
-      <w:r>
-        <w:rPr>
-          <w:rFonts w:ascii="Times New Roman" w:hAnsi="Times New Roman" w:cs="Times New Roman"/>
-          <w:sz w:val="24"/>
-          <w:szCs w:val="24"/>
-        </w:rPr>
-        <w:t xml:space="preserve"> significant figures.</w:t>
-      </w:r>
-      <w:r>
-        <w:rPr>
-          <w:rFonts w:ascii="Times New Roman" w:hAnsi="Times New Roman" w:cs="Times New Roman"/>
-          <w:sz w:val="24"/>
-          <w:szCs w:val="24"/>
-        </w:rPr>
-        <w:t xml:space="preserve"> </w:t>
-      </w:r>
-      <w:r>
-        <w:rPr>
-          <w:rFonts w:ascii="Times New Roman" w:hAnsi="Times New Roman" w:cs="Times New Roman"/>
+          <w:sz w:val="24"/>
+          <w:szCs w:val="24"/>
+        </w:rPr>
+      </w:pPr>
+      <w:r>
+        <w:rPr>
+          <w:rFonts w:ascii="Times New Roman" w:hAnsi="Times New Roman" w:cs="Times New Roman"/>
+          <w:sz w:val="24"/>
+          <w:szCs w:val="24"/>
+        </w:rPr>
+        <w:t>If T is an integer, only S=T is accepted (so integers must be exact).</w:t>
+      </w:r>
+    </w:p>
+    <w:p>
+      <w:pPr>
+        <w:rPr>
+          <w:rFonts w:ascii="Times New Roman" w:hAnsi="Times New Roman" w:cs="Times New Roman"/>
+          <w:i/>
+          <w:iCs/>
+          <w:sz w:val="24"/>
+          <w:szCs w:val="24"/>
+        </w:rPr>
+      </w:pPr>
+      <w:r>
+        <w:rPr>
+          <w:rFonts w:ascii="Times New Roman" w:hAnsi="Times New Roman" w:cs="Times New Roman"/>
+          <w:i/>
+          <w:iCs/>
           <w:sz w:val="24"/>
           <w:szCs w:val="24"/>
         </w:rPr>
         <w:tab/>
-      </w:r>
-      <w:r>
-        <w:rPr>
-          <w:rFonts w:ascii="Times New Roman" w:hAnsi="Times New Roman" w:cs="Times New Roman"/>
-          <w:i/>
-          <w:sz w:val="18"/>
-          <w:szCs w:val="18"/>
-        </w:rPr>
-        <w:t>(So 1.829</w:t>
-      </w:r>
-      <w:r>
-        <w:rPr>
-          <w:rFonts w:ascii="Times New Roman" w:hAnsi="Times New Roman" w:cs="Times New Roman"/>
-          <w:i/>
-          <w:sz w:val="18"/>
-          <w:szCs w:val="18"/>
-        </w:rPr>
-        <w:t xml:space="preserve"> </w:t>
-      </w:r>
-      <w:proofErr w:type="gramStart"/>
-      <w:r>
-        <w:rPr>
-          <w:rFonts w:ascii="Times New Roman" w:hAnsi="Times New Roman" w:cs="Times New Roman"/>
-          <w:i/>
-          <w:sz w:val="18"/>
-          <w:szCs w:val="18"/>
-        </w:rPr>
-        <w:t>is accepted</w:t>
-      </w:r>
-      <w:proofErr w:type="gramEnd"/>
-      <w:r>
-        <w:rPr>
-          <w:rFonts w:ascii="Times New Roman" w:hAnsi="Times New Roman" w:cs="Times New Roman"/>
-          <w:i/>
-          <w:sz w:val="18"/>
-          <w:szCs w:val="18"/>
-        </w:rPr>
-        <w:t xml:space="preserve"> as 1.</w:t>
-      </w:r>
-      <w:r>
-        <w:rPr>
-          <w:rFonts w:ascii="Times New Roman" w:hAnsi="Times New Roman" w:cs="Times New Roman"/>
-          <w:i/>
-          <w:sz w:val="18"/>
-          <w:szCs w:val="18"/>
-        </w:rPr>
-        <w:t>83</w:t>
-      </w:r>
-      <w:r>
-        <w:rPr>
-          <w:rFonts w:ascii="Times New Roman" w:hAnsi="Times New Roman" w:cs="Times New Roman"/>
-          <w:i/>
-          <w:sz w:val="18"/>
-          <w:szCs w:val="18"/>
-        </w:rPr>
-        <w:t>)</w:t>
+        <w:t>E.g.: for T = 1325 only S=1325 is accepted. S=1330 and S=1324.99 will both be rejected.</w:t>
       </w:r>
     </w:p>
     <w:p>
@@ -913,159 +653,107 @@
         </w:tabs>
         <w:rPr>
           <w:rFonts w:ascii="Times New Roman" w:hAnsi="Times New Roman" w:cs="Times New Roman"/>
-          <w:i/>
-          <w:sz w:val="18"/>
-          <w:szCs w:val="24"/>
-        </w:rPr>
-      </w:pPr>
-      <w:r>
-        <w:rPr>
-          <w:rFonts w:ascii="Times New Roman" w:hAnsi="Times New Roman" w:cs="Times New Roman"/>
-          <w:sz w:val="24"/>
-          <w:szCs w:val="24"/>
-        </w:rPr>
-        <w:t>JavaScript</w:t>
-      </w:r>
-      <w:r>
-        <w:rPr>
-          <w:rFonts w:ascii="Times New Roman" w:hAnsi="Times New Roman" w:cs="Times New Roman"/>
-          <w:sz w:val="24"/>
-          <w:szCs w:val="24"/>
-        </w:rPr>
-        <w:t xml:space="preserve"> does not </w:t>
-      </w:r>
-      <w:r>
-        <w:rPr>
-          <w:rFonts w:ascii="Times New Roman" w:hAnsi="Times New Roman" w:cs="Times New Roman"/>
-          <w:sz w:val="24"/>
-          <w:szCs w:val="24"/>
-        </w:rPr>
-        <w:t>store</w:t>
-      </w:r>
-      <w:r>
-        <w:rPr>
-          <w:rFonts w:ascii="Times New Roman" w:hAnsi="Times New Roman" w:cs="Times New Roman"/>
-          <w:sz w:val="24"/>
-          <w:szCs w:val="24"/>
-        </w:rPr>
-        <w:t xml:space="preserve"> trailing zeros</w:t>
-      </w:r>
-      <w:r>
-        <w:rPr>
-          <w:rFonts w:ascii="Times New Roman" w:hAnsi="Times New Roman" w:cs="Times New Roman"/>
-          <w:sz w:val="24"/>
-          <w:szCs w:val="24"/>
-        </w:rPr>
-        <w:t xml:space="preserve">, providing (unintended) </w:t>
-      </w:r>
-      <w:r>
-        <w:rPr>
-          <w:rFonts w:ascii="Times New Roman" w:hAnsi="Times New Roman" w:cs="Times New Roman"/>
-          <w:sz w:val="24"/>
-          <w:szCs w:val="24"/>
-        </w:rPr>
-        <w:t>leniency.</w:t>
-      </w:r>
-      <w:r>
-        <w:rPr>
-          <w:rFonts w:ascii="Times New Roman" w:hAnsi="Times New Roman" w:cs="Times New Roman"/>
+          <w:sz w:val="24"/>
+          <w:szCs w:val="24"/>
+        </w:rPr>
+      </w:pPr>
+      <w:r>
+        <w:rPr>
+          <w:rFonts w:ascii="Times New Roman" w:hAnsi="Times New Roman" w:cs="Times New Roman"/>
+          <w:sz w:val="24"/>
+          <w:szCs w:val="24"/>
+        </w:rPr>
+        <w:t xml:space="preserve">If T is a decimal with 3 or fewer sig figs, then </w:t>
+      </w:r>
+      <w:r>
+        <w:rPr>
+          <w:rFonts w:ascii="Times New Roman" w:hAnsi="Times New Roman" w:cs="Times New Roman"/>
+          <w:sz w:val="24"/>
+          <w:szCs w:val="24"/>
+        </w:rPr>
+        <w:t>any S with</w:t>
+      </w:r>
+      <w:r>
+        <w:rPr>
+          <w:rFonts w:ascii="Times New Roman" w:hAnsi="Times New Roman" w:cs="Times New Roman"/>
+          <w:sz w:val="24"/>
+          <w:szCs w:val="24"/>
+        </w:rPr>
+        <w:t xml:space="preserve"> (S rounded to 3 sig figs) = T is accepted.</w:t>
+      </w:r>
+    </w:p>
+    <w:p>
+      <w:pPr>
+        <w:rPr>
+          <w:rFonts w:ascii="Times New Roman" w:hAnsi="Times New Roman" w:cs="Times New Roman"/>
+          <w:i/>
+          <w:iCs/>
+          <w:sz w:val="24"/>
+          <w:szCs w:val="24"/>
+        </w:rPr>
+      </w:pPr>
+      <w:r>
+        <w:rPr>
+          <w:rFonts w:ascii="Times New Roman" w:hAnsi="Times New Roman" w:cs="Times New Roman"/>
+          <w:i/>
+          <w:iCs/>
           <w:sz w:val="24"/>
           <w:szCs w:val="24"/>
         </w:rPr>
         <w:tab/>
-        <w:t xml:space="preserve"> </w:t>
-      </w:r>
-      <w:r>
-        <w:rPr>
-          <w:rFonts w:ascii="Times New Roman" w:hAnsi="Times New Roman" w:cs="Times New Roman"/>
-          <w:i/>
-          <w:sz w:val="18"/>
-          <w:szCs w:val="24"/>
-        </w:rPr>
-        <w:t>(</w:t>
-      </w:r>
-      <w:r>
-        <w:rPr>
-          <w:rFonts w:ascii="Times New Roman" w:hAnsi="Times New Roman" w:cs="Times New Roman"/>
-          <w:i/>
-          <w:sz w:val="18"/>
-          <w:szCs w:val="24"/>
-        </w:rPr>
-        <w:t>So 1.5</w:t>
-      </w:r>
-      <w:r>
-        <w:rPr>
-          <w:rFonts w:ascii="Times New Roman" w:hAnsi="Times New Roman" w:cs="Times New Roman"/>
-          <w:i/>
-          <w:sz w:val="18"/>
-          <w:szCs w:val="24"/>
-        </w:rPr>
-        <w:t xml:space="preserve"> </w:t>
-      </w:r>
-      <w:proofErr w:type="gramStart"/>
-      <w:r>
-        <w:rPr>
-          <w:rFonts w:ascii="Times New Roman" w:hAnsi="Times New Roman" w:cs="Times New Roman"/>
-          <w:i/>
-          <w:sz w:val="18"/>
-          <w:szCs w:val="24"/>
-        </w:rPr>
-        <w:t xml:space="preserve">is </w:t>
-      </w:r>
-      <w:r>
-        <w:rPr>
-          <w:rFonts w:ascii="Times New Roman" w:hAnsi="Times New Roman" w:cs="Times New Roman"/>
-          <w:i/>
-          <w:sz w:val="18"/>
-          <w:szCs w:val="24"/>
-        </w:rPr>
-        <w:t>wrongfully</w:t>
-      </w:r>
-      <w:r>
-        <w:rPr>
-          <w:rFonts w:ascii="Times New Roman" w:hAnsi="Times New Roman" w:cs="Times New Roman"/>
-          <w:i/>
-          <w:sz w:val="18"/>
-          <w:szCs w:val="24"/>
-        </w:rPr>
-        <w:t xml:space="preserve"> accepted</w:t>
-      </w:r>
-      <w:proofErr w:type="gramEnd"/>
-      <w:r>
-        <w:rPr>
-          <w:rFonts w:ascii="Times New Roman" w:hAnsi="Times New Roman" w:cs="Times New Roman"/>
-          <w:i/>
-          <w:sz w:val="18"/>
-          <w:szCs w:val="24"/>
-        </w:rPr>
-        <w:t xml:space="preserve"> as</w:t>
-      </w:r>
-      <w:r>
-        <w:rPr>
-          <w:rFonts w:ascii="Times New Roman" w:hAnsi="Times New Roman" w:cs="Times New Roman"/>
-          <w:i/>
-          <w:sz w:val="18"/>
-          <w:szCs w:val="24"/>
-        </w:rPr>
-        <w:t xml:space="preserve"> 1.50</w:t>
-      </w:r>
-      <w:r>
-        <w:rPr>
-          <w:rFonts w:ascii="Times New Roman" w:hAnsi="Times New Roman" w:cs="Times New Roman"/>
-          <w:i/>
-          <w:sz w:val="18"/>
-          <w:szCs w:val="24"/>
-        </w:rPr>
-        <w:t>.</w:t>
-      </w:r>
-      <w:r>
-        <w:rPr>
-          <w:rFonts w:ascii="Times New Roman" w:hAnsi="Times New Roman" w:cs="Times New Roman"/>
-          <w:i/>
-          <w:sz w:val="18"/>
-          <w:szCs w:val="24"/>
-        </w:rPr>
-        <w:t>)</w:t>
+        <w:t>E.g.: for T=1.75, all of S=1.75, S=1.7499, S=1.75</w:t>
+      </w:r>
+      <w:r>
+        <w:rPr>
+          <w:rFonts w:ascii="Times New Roman" w:hAnsi="Times New Roman" w:cs="Times New Roman"/>
+          <w:i/>
+          <w:iCs/>
+          <w:sz w:val="24"/>
+          <w:szCs w:val="24"/>
+        </w:rPr>
+        <w:t>3</w:t>
+      </w:r>
+      <w:r>
+        <w:rPr>
+          <w:rFonts w:ascii="Times New Roman" w:hAnsi="Times New Roman" w:cs="Times New Roman"/>
+          <w:i/>
+          <w:iCs/>
+          <w:sz w:val="24"/>
+          <w:szCs w:val="24"/>
+        </w:rPr>
+        <w:t xml:space="preserve"> will be accepted.</w:t>
+      </w:r>
+    </w:p>
+    <w:p>
+      <w:pPr>
+        <w:rPr>
+          <w:rFonts w:ascii="Times New Roman" w:hAnsi="Times New Roman" w:cs="Times New Roman"/>
+          <w:i/>
+          <w:iCs/>
+          <w:sz w:val="24"/>
+          <w:szCs w:val="24"/>
+        </w:rPr>
+      </w:pPr>
+      <w:r>
+        <w:rPr>
+          <w:rFonts w:ascii="Times New Roman" w:hAnsi="Times New Roman" w:cs="Times New Roman"/>
+          <w:i/>
+          <w:iCs/>
+          <w:sz w:val="24"/>
+          <w:szCs w:val="24"/>
+        </w:rPr>
+        <w:tab/>
+        <w:t>For T=1.5, S=1.49 will be rejected</w:t>
+      </w:r>
+      <w:r>
+        <w:rPr>
+          <w:rFonts w:ascii="Times New Roman" w:hAnsi="Times New Roman" w:cs="Times New Roman"/>
+          <w:i/>
+          <w:iCs/>
+          <w:sz w:val="24"/>
+          <w:szCs w:val="24"/>
+        </w:rPr>
+        <w:t>, S=1.50001 will be accepted.</w:t>
       </w:r>
     </w:p>
     <w:p>
@@ -1082,12 +770,221 @@
       <w:r>
         <w:rPr>
           <w:rFonts w:ascii="Times New Roman" w:hAnsi="Times New Roman" w:cs="Times New Roman"/>
-          <w:i/>
-          <w:sz w:val="18"/>
+          <w:sz w:val="24"/>
+          <w:szCs w:val="24"/>
+        </w:rPr>
+        <w:t>If T is a decimal with MORE than 3 sig figs, only S = T is accepted.</w:t>
+      </w:r>
+    </w:p>
+    <w:p>
+      <w:pPr>
+        <w:rPr>
+          <w:rFonts w:ascii="Times New Roman" w:hAnsi="Times New Roman" w:cs="Times New Roman"/>
+          <w:i/>
+          <w:iCs/>
+          <w:sz w:val="24"/>
+          <w:szCs w:val="24"/>
+        </w:rPr>
+      </w:pPr>
+      <w:r>
+        <w:rPr>
+          <w:rFonts w:ascii="Times New Roman" w:hAnsi="Times New Roman" w:cs="Times New Roman"/>
+          <w:i/>
+          <w:iCs/>
+          <w:sz w:val="24"/>
           <w:szCs w:val="24"/>
         </w:rPr>
         <w:tab/>
-        <w:t>(I might fix this later.)</w:t>
+        <w:t>E.g.: for T=1.3725, S=1.3</w:t>
+      </w:r>
+      <w:r>
+        <w:rPr>
+          <w:rFonts w:ascii="Times New Roman" w:hAnsi="Times New Roman" w:cs="Times New Roman"/>
+          <w:i/>
+          <w:iCs/>
+          <w:sz w:val="24"/>
+          <w:szCs w:val="24"/>
+        </w:rPr>
+        <w:t>7</w:t>
+      </w:r>
+      <w:r>
+        <w:rPr>
+          <w:rFonts w:ascii="Times New Roman" w:hAnsi="Times New Roman" w:cs="Times New Roman"/>
+          <w:i/>
+          <w:iCs/>
+          <w:sz w:val="24"/>
+          <w:szCs w:val="24"/>
+        </w:rPr>
+        <w:t xml:space="preserve"> is rejected, S=1.3724999 is rejected.</w:t>
+      </w:r>
+      <w:r>
+        <w:rPr>
+          <w:rFonts w:ascii="Times New Roman" w:hAnsi="Times New Roman" w:cs="Times New Roman"/>
+          <w:i/>
+          <w:iCs/>
+          <w:sz w:val="24"/>
+          <w:szCs w:val="24"/>
+        </w:rPr>
+        <w:t xml:space="preserve"> This allows us to ask “exact value” problems where the answer is a terminating decimal.</w:t>
+      </w:r>
+    </w:p>
+    <w:p>
+      <w:pPr>
+        <w:rPr>
+          <w:rFonts w:ascii="Times New Roman" w:hAnsi="Times New Roman" w:cs="Times New Roman"/>
+          <w:sz w:val="24"/>
+          <w:szCs w:val="24"/>
+        </w:rPr>
+      </w:pPr>
+      <w:r>
+        <w:rPr>
+          <w:rFonts w:ascii="Times New Roman" w:hAnsi="Times New Roman" w:cs="Times New Roman"/>
+          <w:i/>
+          <w:iCs/>
+          <w:sz w:val="24"/>
+          <w:szCs w:val="24"/>
+        </w:rPr>
+        <w:t>(There is some floating point weirdness in how numbers are processed. For example T=13.0 is</w:t>
+      </w:r>
+      <w:r>
+        <w:rPr>
+          <w:rFonts w:ascii="Times New Roman" w:hAnsi="Times New Roman" w:cs="Times New Roman"/>
+          <w:i/>
+          <w:iCs/>
+          <w:sz w:val="24"/>
+          <w:szCs w:val="24"/>
+        </w:rPr>
+        <w:t xml:space="preserve"> falsely</w:t>
+      </w:r>
+      <w:r>
+        <w:rPr>
+          <w:rFonts w:ascii="Times New Roman" w:hAnsi="Times New Roman" w:cs="Times New Roman"/>
+          <w:i/>
+          <w:iCs/>
+          <w:sz w:val="24"/>
+          <w:szCs w:val="24"/>
+        </w:rPr>
+        <w:t xml:space="preserve"> recognized as the integer T=13</w:t>
+      </w:r>
+      <w:r>
+        <w:rPr>
+          <w:rFonts w:ascii="Times New Roman" w:hAnsi="Times New Roman" w:cs="Times New Roman"/>
+          <w:i/>
+          <w:iCs/>
+          <w:sz w:val="24"/>
+          <w:szCs w:val="24"/>
+        </w:rPr>
+        <w:t xml:space="preserve"> unfairly</w:t>
+      </w:r>
+      <w:r>
+        <w:rPr>
+          <w:rFonts w:ascii="Times New Roman" w:hAnsi="Times New Roman" w:cs="Times New Roman"/>
+          <w:i/>
+          <w:iCs/>
+          <w:sz w:val="24"/>
+          <w:szCs w:val="24"/>
+        </w:rPr>
+        <w:t xml:space="preserve"> leading to the rejection of S=12.9999. Also, T=1.28 would not accept S=1.275 </w:t>
+      </w:r>
+      <w:r>
+        <w:rPr>
+          <w:rFonts w:ascii="Times New Roman" w:hAnsi="Times New Roman" w:cs="Times New Roman"/>
+          <w:i/>
+          <w:iCs/>
+          <w:sz w:val="24"/>
+          <w:szCs w:val="24"/>
+        </w:rPr>
+        <w:t>as</w:t>
+      </w:r>
+      <w:r>
+        <w:rPr>
+          <w:rFonts w:ascii="Times New Roman" w:hAnsi="Times New Roman" w:cs="Times New Roman"/>
+          <w:i/>
+          <w:iCs/>
+          <w:sz w:val="24"/>
+          <w:szCs w:val="24"/>
+        </w:rPr>
+        <w:t xml:space="preserve"> (1.275 rounded to 3 sig figs) = 1.27 instead of 1.28 (because float 1.275 is actually smaller than 1.275.)  I could implement fractions, like I did with the function transformation game, but I </w:t>
+      </w:r>
+      <w:r>
+        <w:rPr>
+          <w:rFonts w:ascii="Times New Roman" w:hAnsi="Times New Roman" w:cs="Times New Roman"/>
+          <w:i/>
+          <w:iCs/>
+          <w:sz w:val="24"/>
+          <w:szCs w:val="24"/>
+        </w:rPr>
+        <w:t xml:space="preserve">am </w:t>
+      </w:r>
+      <w:r>
+        <w:rPr>
+          <w:rFonts w:ascii="Times New Roman" w:hAnsi="Times New Roman" w:cs="Times New Roman"/>
+          <w:i/>
+          <w:iCs/>
+          <w:sz w:val="24"/>
+          <w:szCs w:val="24"/>
+        </w:rPr>
+        <w:t>reluctant to do so – it would clutter the UI</w:t>
+      </w:r>
+      <w:r>
+        <w:rPr>
+          <w:rFonts w:ascii="Times New Roman" w:hAnsi="Times New Roman" w:cs="Times New Roman"/>
+          <w:i/>
+          <w:iCs/>
+          <w:sz w:val="24"/>
+          <w:szCs w:val="24"/>
+        </w:rPr>
+        <w:t xml:space="preserve"> and complicate the code</w:t>
+      </w:r>
+      <w:r>
+        <w:rPr>
+          <w:rFonts w:ascii="Times New Roman" w:hAnsi="Times New Roman" w:cs="Times New Roman"/>
+          <w:i/>
+          <w:iCs/>
+          <w:sz w:val="24"/>
+          <w:szCs w:val="24"/>
+        </w:rPr>
+        <w:t xml:space="preserve"> for little benefit.</w:t>
+      </w:r>
+      <w:r>
+        <w:rPr>
+          <w:rFonts w:ascii="Times New Roman" w:hAnsi="Times New Roman" w:cs="Times New Roman"/>
+          <w:i/>
+          <w:iCs/>
+          <w:sz w:val="24"/>
+          <w:szCs w:val="24"/>
+        </w:rPr>
+        <w:t xml:space="preserve"> If the answer is the simplified fraction a/b, we can always just rewrite the question to ask for the value of a+b or 1000</w:t>
+      </w:r>
+      <w:r>
+        <w:rPr>
+          <w:rFonts w:ascii="Times New Roman" w:hAnsi="Times New Roman" w:cs="Times New Roman"/>
+          <w:i/>
+          <w:iCs/>
+          <w:sz w:val="24"/>
+          <w:szCs w:val="24"/>
+        </w:rPr>
+        <w:t>a</w:t>
+      </w:r>
+      <w:r>
+        <w:rPr>
+          <w:rFonts w:ascii="Times New Roman" w:hAnsi="Times New Roman" w:cs="Times New Roman"/>
+          <w:i/>
+          <w:iCs/>
+          <w:sz w:val="24"/>
+          <w:szCs w:val="24"/>
+        </w:rPr>
+        <w:t>+b or something along those lines.</w:t>
+      </w:r>
+      <w:r>
+        <w:rPr>
+          <w:rFonts w:ascii="Times New Roman" w:hAnsi="Times New Roman" w:cs="Times New Roman"/>
+          <w:i/>
+          <w:iCs/>
+          <w:sz w:val="24"/>
+          <w:szCs w:val="24"/>
+        </w:rPr>
+        <w:t>)</w:t>
       </w:r>
       <w:r>
         <w:rPr>
@@ -1264,25 +1161,7 @@
           <w:sz w:val="24"/>
           <w:szCs w:val="24"/>
         </w:rPr>
-        <w:t xml:space="preserve">Optionally: you can add a second picture you wish to overlay after the team color </w:t>
-      </w:r>
-      <w:proofErr w:type="gramStart"/>
-      <w:r>
-        <w:rPr>
-          <w:rFonts w:ascii="Times New Roman" w:hAnsi="Times New Roman" w:cs="Times New Roman"/>
-          <w:sz w:val="24"/>
-          <w:szCs w:val="24"/>
-        </w:rPr>
-        <w:t>was drawn</w:t>
-      </w:r>
-      <w:proofErr w:type="gramEnd"/>
-      <w:r>
-        <w:rPr>
-          <w:rFonts w:ascii="Times New Roman" w:hAnsi="Times New Roman" w:cs="Times New Roman"/>
-          <w:sz w:val="24"/>
-          <w:szCs w:val="24"/>
-        </w:rPr>
-        <w:t xml:space="preserve"> (for e</w:t>
+        <w:t>Optionally: you can add a second picture you wish to overlay after the team color was drawn (for e</w:t>
       </w:r>
       <w:r>
         <w:rPr>
@@ -1596,7 +1475,7 @@
 </file>
 
 <file path=word/numbering.xml><?xml version="1.0" encoding="utf-8"?>
-<w:numbering xmlns:wpc="http://schemas.microsoft.com/office/word/2010/wordprocessingCanvas" xmlns:cx="http://schemas.microsoft.com/office/drawing/2014/chartex" xmlns:cx1="http://schemas.microsoft.com/office/drawing/2015/9/8/chartex" xmlns:mc="http://schemas.openxmlformats.org/markup-compatibility/2006" xmlns:o="urn:schemas-microsoft-com:office:office" xmlns:r="http://schemas.openxmlformats.org/officeDocument/2006/relationships" xmlns:m="http://schemas.openxmlformats.org/officeDocument/2006/math" xmlns:v="urn:schemas-microsoft-com:vml" xmlns:wp14="http://schemas.microsoft.com/office/word/2010/wordprocessingDrawing" xmlns:wp="http://schemas.openxmlformats.org/drawingml/2006/wordprocessingDrawing" xmlns:w10="urn:schemas-microsoft-com:office:word" xmlns:w="http://schemas.openxmlformats.org/wordprocessingml/2006/main" xmlns:w14="http://schemas.microsoft.com/office/word/2010/wordml" xmlns:w15="http://schemas.microsoft.com/office/word/2012/wordml" xmlns:w16se="http://schemas.microsoft.com/office/word/2015/wordml/symex" xmlns:wpg="http://schemas.microsoft.com/office/word/2010/wordprocessingGroup" xmlns:wpi="http://schemas.microsoft.com/office/word/2010/wordprocessingInk" xmlns:wne="http://schemas.microsoft.com/office/word/2006/wordml" xmlns:wps="http://schemas.microsoft.com/office/word/2010/wordprocessingShape" mc:Ignorable="w14 w15 w16se wp14">
+<w:numbering xmlns:wpc="http://schemas.microsoft.com/office/word/2010/wordprocessingCanvas" xmlns:cx="http://schemas.microsoft.com/office/drawing/2014/chartex" xmlns:cx1="http://schemas.microsoft.com/office/drawing/2015/9/8/chartex" xmlns:cx2="http://schemas.microsoft.com/office/drawing/2015/10/21/chartex" xmlns:cx3="http://schemas.microsoft.com/office/drawing/2016/5/9/chartex" xmlns:cx4="http://schemas.microsoft.com/office/drawing/2016/5/10/chartex" xmlns:cx5="http://schemas.microsoft.com/office/drawing/2016/5/11/chartex" xmlns:cx6="http://schemas.microsoft.com/office/drawing/2016/5/12/chartex" xmlns:cx7="http://schemas.microsoft.com/office/drawing/2016/5/13/chartex" xmlns:cx8="http://schemas.microsoft.com/office/drawing/2016/5/14/chartex" xmlns:mc="http://schemas.openxmlformats.org/markup-compatibility/2006" xmlns:aink="http://schemas.microsoft.com/office/drawing/2016/ink" xmlns:am3d="http://schemas.microsoft.com/office/drawing/2017/model3d" xmlns:o="urn:schemas-microsoft-com:office:office" xmlns:oel="http://schemas.microsoft.com/office/2019/extlst" xmlns:r="http://schemas.openxmlformats.org/officeDocument/2006/relationships" xmlns:m="http://schemas.openxmlformats.org/officeDocument/2006/math" xmlns:v="urn:schemas-microsoft-com:vml" xmlns:wp14="http://schemas.microsoft.com/office/word/2010/wordprocessingDrawing" xmlns:wp="http://schemas.openxmlformats.org/drawingml/2006/wordprocessingDrawing" xmlns:w10="urn:schemas-microsoft-com:office:word" xmlns:w="http://schemas.openxmlformats.org/wordprocessingml/2006/main" xmlns:w14="http://schemas.microsoft.com/office/word/2010/wordml" xmlns:w15="http://schemas.microsoft.com/office/word/2012/wordml" xmlns:w16cex="http://schemas.microsoft.com/office/word/2018/wordml/cex" xmlns:w16cid="http://schemas.microsoft.com/office/word/2016/wordml/cid" xmlns:w16="http://schemas.microsoft.com/office/word/2018/wordml" xmlns:w16du="http://schemas.microsoft.com/office/word/2023/wordml/word16du" xmlns:w16sdtdh="http://schemas.microsoft.com/office/word/2020/wordml/sdtdatahash" xmlns:w16sdtfl="http://schemas.microsoft.com/office/word/2024/wordml/sdtformatlock" xmlns:w16se="http://schemas.microsoft.com/office/word/2015/wordml/symex" xmlns:wpg="http://schemas.microsoft.com/office/word/2010/wordprocessingGroup" xmlns:wpi="http://schemas.microsoft.com/office/word/2010/wordprocessingInk" xmlns:wne="http://schemas.microsoft.com/office/word/2006/wordml" xmlns:wps="http://schemas.microsoft.com/office/word/2010/wordprocessingShape" mc:Ignorable="w14 w15 w16se w16cid w16 w16cex w16sdtdh w16sdtfl w16du wp14">
   <w:abstractNum w:abstractNumId="0" w15:restartNumberingAfterBreak="0">
     <w:nsid w:val="067D19DA"/>
     <w:multiLevelType w:val="hybridMultilevel"/>
@@ -1912,20 +1791,20 @@
       </w:pPr>
     </w:lvl>
   </w:abstractNum>
-  <w:num w:numId="1">
+  <w:num w:numId="1" w16cid:durableId="1805344565">
     <w:abstractNumId w:val="0"/>
   </w:num>
-  <w:num w:numId="2">
+  <w:num w:numId="2" w16cid:durableId="1846095020">
     <w:abstractNumId w:val="2"/>
   </w:num>
-  <w:num w:numId="3">
+  <w:num w:numId="3" w16cid:durableId="1723482171">
     <w:abstractNumId w:val="1"/>
   </w:num>
 </w:numbering>
 </file>
 
 <file path=word/styles.xml><?xml version="1.0" encoding="utf-8"?>
-<w:styles xmlns:mc="http://schemas.openxmlformats.org/markup-compatibility/2006" xmlns:r="http://schemas.openxmlformats.org/officeDocument/2006/relationships" xmlns:w="http://schemas.openxmlformats.org/wordprocessingml/2006/main" xmlns:w14="http://schemas.microsoft.com/office/word/2010/wordml" xmlns:w15="http://schemas.microsoft.com/office/word/2012/wordml" xmlns:w16se="http://schemas.microsoft.com/office/word/2015/wordml/symex" mc:Ignorable="w14 w15 w16se">
+<w:styles xmlns:mc="http://schemas.openxmlformats.org/markup-compatibility/2006" xmlns:r="http://schemas.openxmlformats.org/officeDocument/2006/relationships" xmlns:w="http://schemas.openxmlformats.org/wordprocessingml/2006/main" xmlns:w14="http://schemas.microsoft.com/office/word/2010/wordml" xmlns:w15="http://schemas.microsoft.com/office/word/2012/wordml" xmlns:w16cex="http://schemas.microsoft.com/office/word/2018/wordml/cex" xmlns:w16cid="http://schemas.microsoft.com/office/word/2016/wordml/cid" xmlns:w16="http://schemas.microsoft.com/office/word/2018/wordml" xmlns:w16du="http://schemas.microsoft.com/office/word/2023/wordml/word16du" xmlns:w16sdtdh="http://schemas.microsoft.com/office/word/2020/wordml/sdtdatahash" xmlns:w16sdtfl="http://schemas.microsoft.com/office/word/2024/wordml/sdtformatlock" xmlns:w16se="http://schemas.microsoft.com/office/word/2015/wordml/symex" mc:Ignorable="w14 w15 w16se w16cid w16 w16cex w16sdtdh w16sdtfl w16du">
   <w:docDefaults>
     <w:rPrDefault>
       <w:rPr>
@@ -1941,7 +1820,7 @@
       </w:pPr>
     </w:pPrDefault>
   </w:docDefaults>
-  <w:latentStyles w:defLockedState="0" w:defUIPriority="99" w:defSemiHidden="0" w:defUnhideWhenUsed="0" w:defQFormat="0" w:count="371">
+  <w:latentStyles w:defLockedState="0" w:defUIPriority="99" w:defSemiHidden="0" w:defUnhideWhenUsed="0" w:defQFormat="0" w:count="376">
     <w:lsdException w:name="Normal" w:uiPriority="0" w:qFormat="1"/>
     <w:lsdException w:name="heading 1" w:uiPriority="9" w:qFormat="1"/>
     <w:lsdException w:name="heading 2" w:semiHidden="1" w:uiPriority="9" w:unhideWhenUsed="1" w:qFormat="1"/>
@@ -2313,6 +2192,11 @@
     <w:lsdException w:name="List Table 5 Dark Accent 6" w:uiPriority="50"/>
     <w:lsdException w:name="List Table 6 Colorful Accent 6" w:uiPriority="51"/>
     <w:lsdException w:name="List Table 7 Colorful Accent 6" w:uiPriority="52"/>
+    <w:lsdException w:name="Mention" w:semiHidden="1" w:unhideWhenUsed="1"/>
+    <w:lsdException w:name="Smart Hyperlink" w:semiHidden="1" w:unhideWhenUsed="1"/>
+    <w:lsdException w:name="Hashtag" w:semiHidden="1" w:unhideWhenUsed="1"/>
+    <w:lsdException w:name="Unresolved Mention" w:semiHidden="1" w:unhideWhenUsed="1"/>
+    <w:lsdException w:name="Smart Link" w:semiHidden="1" w:unhideWhenUsed="1"/>
   </w:latentStyles>
   <w:style w:type="paragraph" w:default="1" w:styleId="Normal">
     <w:name w:val="Normal"/>

</xml_diff>